<commit_message>
further changes to word template. problem: pagebreak not working
</commit_message>
<xml_diff>
--- a/templates/word-template/bfh-reference.docx
+++ b/templates/word-template/bfh-reference.docx
@@ -1,18 +1,446 @@
 
 <file path=word/document.xml><?xml version="1.0" encoding="utf-8"?>
-<w:document xmlns:wpc="http://schemas.microsoft.com/office/word/2010/wordprocessingCanvas" xmlns:cx="http://schemas.microsoft.com/office/drawing/2014/chartex" xmlns:cx1="http://schemas.microsoft.com/office/drawing/2015/9/8/chartex" xmlns:cx2="http://schemas.microsoft.com/office/drawing/2015/10/21/chartex" xmlns:cx3="http://schemas.microsoft.com/office/drawing/2016/5/9/chartex" xmlns:cx4="http://schemas.microsoft.com/office/drawing/2016/5/10/chartex" xmlns:cx5="http://schemas.microsoft.com/office/drawing/2016/5/11/chartex" xmlns:cx6="http://schemas.microsoft.com/office/drawing/2016/5/12/chartex" xmlns:cx7="http://schemas.microsoft.com/office/drawing/2016/5/13/chartex" xmlns:cx8="http://schemas.microsoft.com/office/drawing/2016/5/14/chartex" xmlns:mc="http://schemas.openxmlformats.org/markup-compatibility/2006" xmlns:aink="http://schemas.microsoft.com/office/drawing/2016/ink" xmlns:am3d="http://schemas.microsoft.com/office/drawing/2017/model3d" xmlns:o="urn:schemas-microsoft-com:office:office" xmlns:oel="http://schemas.microsoft.com/office/2019/extlst" xmlns:r="http://schemas.openxmlformats.org/officeDocument/2006/relationships" xmlns:m="http://schemas.openxmlformats.org/officeDocument/2006/math" xmlns:v="urn:schemas-microsoft-com:vml" xmlns:wp14="http://schemas.microsoft.com/office/word/2010/wordprocessingDrawing" xmlns:wp="http://schemas.openxmlformats.org/drawingml/2006/wordprocessingDrawing" xmlns:w10="urn:schemas-microsoft-com:office:word" xmlns:w="http://schemas.openxmlformats.org/wordprocessingml/2006/main" xmlns:w14="http://schemas.microsoft.com/office/word/2010/wordml" xmlns:w15="http://schemas.microsoft.com/office/word/2012/wordml" xmlns:w16cex="http://schemas.microsoft.com/office/word/2018/wordml/cex" xmlns:w16cid="http://schemas.microsoft.com/office/word/2016/wordml/cid" xmlns:w16="http://schemas.microsoft.com/office/word/2018/wordml" xmlns:w16du="http://schemas.microsoft.com/office/word/2023/wordml/word16du" xmlns:w16sdtdh="http://schemas.microsoft.com/office/word/2020/wordml/sdtdatahash" xmlns:w16sdtfl="http://schemas.microsoft.com/office/word/2024/wordml/sdtformatlock" xmlns:w16se="http://schemas.microsoft.com/office/word/2015/wordml/symex" xmlns:wpg="http://schemas.microsoft.com/office/word/2010/wordprocessingGroup" xmlns:wpi="http://schemas.microsoft.com/office/word/2010/wordprocessingInk" xmlns:wne="http://schemas.microsoft.com/office/word/2006/wordml" xmlns:wps="http://schemas.microsoft.com/office/word/2010/wordprocessingShape" mc:Ignorable="w14 w15 w16se w16cid w16 w16cex w16sdtdh w16sdtfl w16du wp14">
+<w:document xmlns:wpc="http://schemas.microsoft.com/office/word/2010/wordprocessingCanvas" xmlns:cx="http://schemas.microsoft.com/office/drawing/2014/chartex" xmlns:cx1="http://schemas.microsoft.com/office/drawing/2015/9/8/chartex" xmlns:cx2="http://schemas.microsoft.com/office/drawing/2015/10/21/chartex" xmlns:cx3="http://schemas.microsoft.com/office/drawing/2016/5/9/chartex" xmlns:cx4="http://schemas.microsoft.com/office/drawing/2016/5/10/chartex" xmlns:cx5="http://schemas.microsoft.com/office/drawing/2016/5/11/chartex" xmlns:cx6="http://schemas.microsoft.com/office/drawing/2016/5/12/chartex" xmlns:cx7="http://schemas.microsoft.com/office/drawing/2016/5/13/chartex" xmlns:cx8="http://schemas.microsoft.com/office/drawing/2016/5/14/chartex" xmlns:mc="http://schemas.openxmlformats.org/markup-compatibility/2006" xmlns:aink="http://schemas.microsoft.com/office/drawing/2016/ink" xmlns:am3d="http://schemas.microsoft.com/office/drawing/2017/model3d" xmlns:o="urn:schemas-microsoft-com:office:office" xmlns:oel="http://schemas.microsoft.com/office/2019/extlst" xmlns:r="http://schemas.openxmlformats.org/officeDocument/2006/relationships" xmlns:m="http://schemas.openxmlformats.org/officeDocument/2006/math" xmlns:v="urn:schemas-microsoft-com:vml" xmlns:wp14="http://schemas.microsoft.com/office/word/2010/wordprocessingDrawing" xmlns:wp="http://schemas.openxmlformats.org/drawingml/2006/wordprocessingDrawing" xmlns:w10="urn:schemas-microsoft-com:office:word" xmlns:w="http://schemas.openxmlformats.org/wordprocessingml/2006/main" xmlns:w14="http://schemas.microsoft.com/office/word/2010/wordml" xmlns:w15="http://schemas.microsoft.com/office/word/2012/wordml" xmlns:w16cex="http://schemas.microsoft.com/office/word/2018/wordml/cex" xmlns:w16cid="http://schemas.microsoft.com/office/word/2016/wordml/cid" xmlns:w16="http://schemas.microsoft.com/office/word/2018/wordml" xmlns:w16sdtdh="http://schemas.microsoft.com/office/word/2020/wordml/sdtdatahash" xmlns:w16se="http://schemas.microsoft.com/office/word/2015/wordml/symex" xmlns:wpg="http://schemas.microsoft.com/office/word/2010/wordprocessingGroup" xmlns:wpi="http://schemas.microsoft.com/office/word/2010/wordprocessingInk" xmlns:wne="http://schemas.microsoft.com/office/word/2006/wordml" xmlns:wps="http://schemas.microsoft.com/office/word/2010/wordprocessingShape" mc:Ignorable="w14 w15 w16se w16cid w16 w16cex w16sdtdh wp14">
   <w:body>
+    <w:tbl>
+      <w:tblPr>
+        <w:tblW w:w="0" w:type="auto"/>
+        <w:tblLook w:val="01E0" w:firstRow="1" w:lastRow="1" w:firstColumn="1" w:lastColumn="1" w:noHBand="0" w:noVBand="0"/>
+      </w:tblPr>
+      <w:tblGrid>
+        <w:gridCol w:w="4249"/>
+        <w:gridCol w:w="4254"/>
+      </w:tblGrid>
+      <w:tr>
+        <w:trPr>
+          <w:trHeight w:val="5387"/>
+        </w:trPr>
+        <w:tc>
+          <w:tcPr>
+            <w:tcW w:w="8643" w:type="dxa"/>
+            <w:gridSpan w:val="2"/>
+          </w:tcPr>
+          <w:p>
+            <w:pPr>
+              <w:spacing w:line="240" w:lineRule="auto"/>
+              <w:rPr>
+                <w:rFonts w:eastAsia="Arial" w:cs="Arial"/>
+                <w:b/>
+                <w:bCs/>
+                <w:sz w:val="44"/>
+                <w:szCs w:val="48"/>
+              </w:rPr>
+            </w:pPr>
+            <w:r>
+              <w:rPr>
+                <w:b/>
+                <w:bCs/>
+                <w:sz w:val="44"/>
+                <w:szCs w:val="48"/>
+              </w:rPr>
+              <w:t>Titel</w:t>
+            </w:r>
+          </w:p>
+          <w:p>
+            <w:pPr>
+              <w:tabs>
+                <w:tab w:val="left" w:pos="5387"/>
+              </w:tabs>
+              <w:spacing w:after="80" w:line="244" w:lineRule="atLeast"/>
+              <w:rPr>
+                <w:rFonts w:eastAsia="Arial" w:cs="Arial"/>
+                <w:sz w:val="32"/>
+                <w:szCs w:val="36"/>
+              </w:rPr>
+            </w:pPr>
+          </w:p>
+        </w:tc>
+      </w:tr>
+      <w:tr>
+        <w:trPr>
+          <w:trHeight w:val="285"/>
+        </w:trPr>
+        <w:tc>
+          <w:tcPr>
+            <w:tcW w:w="4321" w:type="dxa"/>
+          </w:tcPr>
+          <w:p>
+            <w:pPr>
+              <w:rPr>
+                <w:szCs w:val="22"/>
+              </w:rPr>
+            </w:pPr>
+            <w:r>
+              <w:rPr>
+                <w:szCs w:val="22"/>
+              </w:rPr>
+              <w:t>Art</w:t>
+            </w:r>
+            <w:r>
+              <w:rPr>
+                <w:szCs w:val="22"/>
+              </w:rPr>
+              <w:t xml:space="preserve"> </w:t>
+            </w:r>
+            <w:r>
+              <w:rPr>
+                <w:szCs w:val="22"/>
+              </w:rPr>
+              <w:t>der</w:t>
+            </w:r>
+            <w:r>
+              <w:rPr>
+                <w:szCs w:val="22"/>
+              </w:rPr>
+              <w:t xml:space="preserve"> </w:t>
+            </w:r>
+            <w:r>
+              <w:rPr>
+                <w:szCs w:val="22"/>
+              </w:rPr>
+              <w:t>Arbeit</w:t>
+            </w:r>
+          </w:p>
+        </w:tc>
+        <w:tc>
+          <w:tcPr>
+            <w:tcW w:w="4322" w:type="dxa"/>
+          </w:tcPr>
+          <w:p>
+            <w:pPr>
+              <w:rPr>
+                <w:szCs w:val="22"/>
+              </w:rPr>
+            </w:pPr>
+          </w:p>
+        </w:tc>
+      </w:tr>
+      <w:tr>
+        <w:trPr>
+          <w:trHeight w:val="1701"/>
+        </w:trPr>
+        <w:tc>
+          <w:tcPr>
+            <w:tcW w:w="4321" w:type="dxa"/>
+          </w:tcPr>
+          <w:p>
+            <w:r>
+              <w:t>Autor</w:t>
+            </w:r>
+            <w:r>
+              <w:t>*</w:t>
+            </w:r>
+            <w:r>
+              <w:t>in 1 (</w:t>
+            </w:r>
+            <w:r>
+              <w:t>Vorname Nachname</w:t>
+            </w:r>
+            <w:r>
+              <w:t>)</w:t>
+            </w:r>
+          </w:p>
+          <w:p>
+            <w:r>
+              <w:t>ggf. weiter Autor</w:t>
+            </w:r>
+            <w:r>
+              <w:t>*</w:t>
+            </w:r>
+            <w:r>
+              <w:t>innen</w:t>
+            </w:r>
+          </w:p>
+        </w:tc>
+        <w:tc>
+          <w:tcPr>
+            <w:tcW w:w="4322" w:type="dxa"/>
+          </w:tcPr>
+          <w:p>
+            <w:r>
+              <w:t>Matrikel-Nr.</w:t>
+            </w:r>
+          </w:p>
+          <w:p>
+            <w:r>
+              <w:t>Matrikel-Nr.</w:t>
+            </w:r>
+          </w:p>
+        </w:tc>
+      </w:tr>
+      <w:tr>
+        <w:trPr>
+          <w:trHeight w:val="1418"/>
+        </w:trPr>
+        <w:tc>
+          <w:tcPr>
+            <w:tcW w:w="8643" w:type="dxa"/>
+            <w:gridSpan w:val="2"/>
+          </w:tcPr>
+          <w:p>
+            <w:r>
+              <w:t xml:space="preserve">Berner Fachhochschule </w:t>
+            </w:r>
+            <w:r>
+              <w:t xml:space="preserve">Departement </w:t>
+            </w:r>
+            <w:r>
+              <w:t>Gesundheit</w:t>
+            </w:r>
+          </w:p>
+          <w:p>
+            <w:r>
+              <w:t>Studiengang, Jahrgang</w:t>
+            </w:r>
+            <w:r>
+              <w:t>,</w:t>
+            </w:r>
+            <w:r>
+              <w:t xml:space="preserve"> Standort</w:t>
+            </w:r>
+          </w:p>
+        </w:tc>
+      </w:tr>
+      <w:tr>
+        <w:trPr>
+          <w:trHeight w:val="1418"/>
+        </w:trPr>
+        <w:tc>
+          <w:tcPr>
+            <w:tcW w:w="4321" w:type="dxa"/>
+          </w:tcPr>
+          <w:p>
+            <w:r>
+              <w:rPr>
+                <w:lang w:val="de-DE"/>
+              </w:rPr>
+              <w:t xml:space="preserve">Auftraggebende </w:t>
+            </w:r>
+            <w:r>
+              <w:rPr>
+                <w:lang w:val="de-DE"/>
+              </w:rPr>
+              <w:t>Lehrperson</w:t>
+            </w:r>
+            <w:r>
+              <w:rPr>
+                <w:lang w:val="de-DE"/>
+              </w:rPr>
+              <w:t xml:space="preserve"> </w:t>
+            </w:r>
+            <w:r>
+              <w:rPr>
+                <w:lang w:val="de-DE"/>
+              </w:rPr>
+              <w:t xml:space="preserve">bzw. </w:t>
+            </w:r>
+            <w:r>
+              <w:rPr>
+                <w:lang w:val="de-DE"/>
+              </w:rPr>
+              <w:br/>
+            </w:r>
+            <w:r>
+              <w:rPr>
+                <w:lang w:val="de-DE"/>
+              </w:rPr>
+              <w:t>Referent</w:t>
+            </w:r>
+            <w:r>
+              <w:rPr>
+                <w:lang w:val="de-DE"/>
+              </w:rPr>
+              <w:t>*</w:t>
+            </w:r>
+            <w:r>
+              <w:rPr>
+                <w:lang w:val="de-DE"/>
+              </w:rPr>
+              <w:t>in</w:t>
+            </w:r>
+          </w:p>
+          <w:p>
+            <w:r>
+              <w:t xml:space="preserve">ggf. </w:t>
+            </w:r>
+            <w:r>
+              <w:t>Co</w:t>
+            </w:r>
+            <w:r>
+              <w:t>~</w:t>
+            </w:r>
+          </w:p>
+        </w:tc>
+        <w:tc>
+          <w:tcPr>
+            <w:tcW w:w="4322" w:type="dxa"/>
+          </w:tcPr>
+          <w:p>
+            <w:r>
+              <w:t>Vorname Nachname, Titel</w:t>
+            </w:r>
+          </w:p>
+          <w:p>
+            <w:r>
+              <w:t>Vorname Nachname, Titel</w:t>
+            </w:r>
+          </w:p>
+        </w:tc>
+      </w:tr>
+      <w:tr>
+        <w:trPr>
+          <w:trHeight w:val="964"/>
+        </w:trPr>
+        <w:tc>
+          <w:tcPr>
+            <w:tcW w:w="4321" w:type="dxa"/>
+          </w:tcPr>
+          <w:p>
+            <w:r>
+              <w:t xml:space="preserve">Externer </w:t>
+            </w:r>
+            <w:r>
+              <w:t>Auftraggeber</w:t>
+            </w:r>
+            <w:r>
+              <w:t>*in</w:t>
+            </w:r>
+            <w:r>
+              <w:t xml:space="preserve"> (</w:t>
+            </w:r>
+            <w:r>
+              <w:t>wenn zutreffend</w:t>
+            </w:r>
+            <w:r>
+              <w:t>)</w:t>
+            </w:r>
+          </w:p>
+        </w:tc>
+        <w:tc>
+          <w:tcPr>
+            <w:tcW w:w="4322" w:type="dxa"/>
+          </w:tcPr>
+          <w:p>
+            <w:r>
+              <w:t>Vorname Nachname, Titel</w:t>
+            </w:r>
+          </w:p>
+          <w:p>
+            <w:r>
+              <w:t xml:space="preserve"> und/oder Institution</w:t>
+            </w:r>
+            <w:r>
+              <w:t>*en</w:t>
+            </w:r>
+          </w:p>
+        </w:tc>
+      </w:tr>
+      <w:tr>
+        <w:tc>
+          <w:tcPr>
+            <w:tcW w:w="8643" w:type="dxa"/>
+            <w:gridSpan w:val="2"/>
+          </w:tcPr>
+          <w:p>
+            <w:r>
+              <w:t>Ort, Abgabedatum</w:t>
+            </w:r>
+          </w:p>
+        </w:tc>
+      </w:tr>
+    </w:tbl>
+    <w:p>
+      <w:pPr>
+        <w:spacing w:line="240" w:lineRule="auto"/>
+      </w:pPr>
+    </w:p>
+    <w:p>
+      <w:pPr>
+        <w:spacing w:line="240" w:lineRule="auto"/>
+        <w:rPr>
+          <w:lang w:val="de-CH"/>
+        </w:rPr>
+      </w:pPr>
+      <w:r>
+        <w:lastRenderedPageBreak/>
+        <w:t xml:space="preserve">Danksagung </w:t>
+      </w:r>
+      <w:r>
+        <w:rPr>
+          <w:szCs w:val="22"/>
+        </w:rPr>
+        <w:t>(</w:t>
+      </w:r>
+      <w:r>
+        <w:rPr>
+          <w:szCs w:val="22"/>
+        </w:rPr>
+        <w:t>o</w:t>
+      </w:r>
+      <w:r>
+        <w:rPr>
+          <w:szCs w:val="22"/>
+        </w:rPr>
+        <w:t>ptional</w:t>
+      </w:r>
+      <w:r>
+        <w:rPr>
+          <w:szCs w:val="22"/>
+        </w:rPr>
+        <w:t>;</w:t>
+      </w:r>
+      <w:r>
+        <w:rPr>
+          <w:szCs w:val="22"/>
+        </w:rPr>
+        <w:t xml:space="preserve"> in </w:t>
+      </w:r>
+      <w:r>
+        <w:rPr>
+          <w:szCs w:val="22"/>
+        </w:rPr>
+        <w:t>Bachelort</w:t>
+      </w:r>
+      <w:r>
+        <w:rPr>
+          <w:szCs w:val="22"/>
+        </w:rPr>
+        <w:t>hesis</w:t>
+      </w:r>
+      <w:r>
+        <w:rPr>
+          <w:szCs w:val="22"/>
+        </w:rPr>
+        <w:t>)</w:t>
+      </w:r>
+    </w:p>
+    <w:p>
+      <w:pPr>
+        <w:sectPr>
+          <w:headerReference w:type="default" r:id="rId15"/>
+          <w:headerReference w:type="first" r:id="rId13"/>
+          <w:footerReference w:type="default" r:id="rId16"/>
+          <w:footerReference w:type="first" r:id="rId14"/>
+          <w:pgMar w:top="1418" w:right="1418" w:bottom="1418" w:left="1985" w:header="709" w:footer="709" w:gutter="0"/>
+          <w:titlePg/>
+          <w:pgSz w:w="11906" w:h="16838"/>
+          <w:cols w:space="708"/>
+          <w:docGrid w:linePitch="360"/>
+        </w:sectPr>
+      </w:pPr>
+    </w:p>
     <w:p>
       <w:pPr>
         <w:pStyle w:val="Inhaltsverzeichnis"/>
       </w:pPr>
       <w:r>
+        <w:lastRenderedPageBreak/>
         <w:t>inhaltsverzeichnis</w:t>
       </w:r>
     </w:p>
     <w:p>
       <w:pPr>
-        <w:pStyle w:val="TOC1"/>
+        <w:pStyle w:val="Verzeichnis1"/>
         <w:rPr>
           <w:rFonts w:asciiTheme="minorHAnsi" w:eastAsiaTheme="minorEastAsia" w:hAnsiTheme="minorHAnsi" w:cstheme="minorBidi"/>
           <w:b w:val="0"/>
@@ -104,7 +532,7 @@
     </w:p>
     <w:p>
       <w:pPr>
-        <w:pStyle w:val="TOC1"/>
+        <w:pStyle w:val="Verzeichnis1"/>
         <w:rPr>
           <w:rFonts w:asciiTheme="minorHAnsi" w:eastAsiaTheme="minorEastAsia" w:hAnsiTheme="minorHAnsi" w:cstheme="minorBidi"/>
           <w:b w:val="0"/>
@@ -194,7 +622,7 @@
     </w:p>
     <w:p>
       <w:pPr>
-        <w:pStyle w:val="TOC1"/>
+        <w:pStyle w:val="Verzeichnis1"/>
         <w:rPr>
           <w:rFonts w:asciiTheme="minorHAnsi" w:eastAsiaTheme="minorEastAsia" w:hAnsiTheme="minorHAnsi" w:cstheme="minorBidi"/>
           <w:b w:val="0"/>
@@ -284,7 +712,7 @@
     </w:p>
     <w:p>
       <w:pPr>
-        <w:pStyle w:val="TOC1"/>
+        <w:pStyle w:val="Verzeichnis1"/>
         <w:rPr>
           <w:rFonts w:asciiTheme="minorHAnsi" w:eastAsiaTheme="minorEastAsia" w:hAnsiTheme="minorHAnsi" w:cstheme="minorBidi"/>
           <w:b w:val="0"/>
@@ -374,7 +802,7 @@
     </w:p>
     <w:p>
       <w:pPr>
-        <w:pStyle w:val="TOC2"/>
+        <w:pStyle w:val="Verzeichnis2"/>
         <w:rPr>
           <w:rFonts w:asciiTheme="minorHAnsi" w:eastAsiaTheme="minorEastAsia" w:hAnsiTheme="minorHAnsi" w:cstheme="minorBidi"/>
           <w:noProof/>
@@ -462,7 +890,7 @@
     </w:p>
     <w:p>
       <w:pPr>
-        <w:pStyle w:val="TOC3"/>
+        <w:pStyle w:val="Verzeichnis3"/>
         <w:rPr>
           <w:rFonts w:asciiTheme="minorHAnsi" w:eastAsiaTheme="minorEastAsia" w:hAnsiTheme="minorHAnsi" w:cstheme="minorBidi"/>
           <w:noProof/>
@@ -550,7 +978,7 @@
     </w:p>
     <w:p>
       <w:pPr>
-        <w:pStyle w:val="TOC1"/>
+        <w:pStyle w:val="Verzeichnis1"/>
         <w:rPr>
           <w:rFonts w:asciiTheme="minorHAnsi" w:eastAsiaTheme="minorEastAsia" w:hAnsiTheme="minorHAnsi" w:cstheme="minorBidi"/>
           <w:b w:val="0"/>
@@ -640,7 +1068,7 @@
     </w:p>
     <w:p>
       <w:pPr>
-        <w:pStyle w:val="TOC1"/>
+        <w:pStyle w:val="Verzeichnis1"/>
         <w:rPr>
           <w:rFonts w:asciiTheme="minorHAnsi" w:eastAsiaTheme="minorEastAsia" w:hAnsiTheme="minorHAnsi" w:cstheme="minorBidi"/>
           <w:b w:val="0"/>
@@ -730,7 +1158,7 @@
     </w:p>
     <w:p>
       <w:pPr>
-        <w:pStyle w:val="TOC1"/>
+        <w:pStyle w:val="Verzeichnis1"/>
         <w:rPr>
           <w:rFonts w:asciiTheme="minorHAnsi" w:eastAsiaTheme="minorEastAsia" w:hAnsiTheme="minorHAnsi" w:cstheme="minorBidi"/>
           <w:b w:val="0"/>
@@ -820,7 +1248,7 @@
     </w:p>
     <w:p>
       <w:pPr>
-        <w:pStyle w:val="TOC1"/>
+        <w:pStyle w:val="Verzeichnis1"/>
         <w:rPr>
           <w:rFonts w:asciiTheme="minorHAnsi" w:eastAsiaTheme="minorEastAsia" w:hAnsiTheme="minorHAnsi" w:cstheme="minorBidi"/>
           <w:b w:val="0"/>
@@ -910,7 +1338,7 @@
     </w:p>
     <w:p>
       <w:pPr>
-        <w:pStyle w:val="TOC1"/>
+        <w:pStyle w:val="Verzeichnis1"/>
         <w:rPr>
           <w:rFonts w:asciiTheme="minorHAnsi" w:eastAsiaTheme="minorEastAsia" w:hAnsiTheme="minorHAnsi" w:cstheme="minorBidi"/>
           <w:b w:val="0"/>
@@ -1000,7 +1428,7 @@
     </w:p>
     <w:p>
       <w:pPr>
-        <w:pStyle w:val="TOC1"/>
+        <w:pStyle w:val="Verzeichnis1"/>
         <w:rPr>
           <w:rFonts w:asciiTheme="minorHAnsi" w:eastAsiaTheme="minorEastAsia" w:hAnsiTheme="minorHAnsi" w:cstheme="minorBidi"/>
           <w:b w:val="0"/>
@@ -1090,7 +1518,7 @@
     </w:p>
     <w:p>
       <w:pPr>
-        <w:pStyle w:val="TOC1"/>
+        <w:pStyle w:val="Verzeichnis1"/>
         <w:rPr>
           <w:rFonts w:asciiTheme="minorHAnsi" w:eastAsiaTheme="minorEastAsia" w:hAnsiTheme="minorHAnsi" w:cstheme="minorBidi"/>
           <w:b w:val="0"/>
@@ -1180,7 +1608,7 @@
     </w:p>
     <w:p>
       <w:pPr>
-        <w:pStyle w:val="TOC1"/>
+        <w:pStyle w:val="Verzeichnis1"/>
         <w:rPr>
           <w:rFonts w:asciiTheme="minorHAnsi" w:eastAsiaTheme="minorEastAsia" w:hAnsiTheme="minorHAnsi" w:cstheme="minorBidi"/>
           <w:b w:val="0"/>
@@ -1270,7 +1698,7 @@
     </w:p>
     <w:p>
       <w:pPr>
-        <w:pStyle w:val="TOC1"/>
+        <w:pStyle w:val="Verzeichnis1"/>
         <w:rPr>
           <w:rFonts w:asciiTheme="minorHAnsi" w:eastAsiaTheme="minorEastAsia" w:hAnsiTheme="minorHAnsi" w:cstheme="minorBidi"/>
           <w:b w:val="0"/>
@@ -1360,7 +1788,7 @@
     </w:p>
     <w:p>
       <w:pPr>
-        <w:pStyle w:val="TOC1"/>
+        <w:pStyle w:val="Verzeichnis1"/>
         <w:rPr>
           <w:rFonts w:asciiTheme="minorHAnsi" w:eastAsiaTheme="minorEastAsia" w:hAnsiTheme="minorHAnsi" w:cstheme="minorBidi"/>
           <w:b w:val="0"/>
@@ -1450,7 +1878,7 @@
     </w:p>
     <w:p>
       <w:pPr>
-        <w:pStyle w:val="TOC2"/>
+        <w:pStyle w:val="Verzeichnis2"/>
         <w:rPr>
           <w:rFonts w:asciiTheme="minorHAnsi" w:eastAsiaTheme="minorEastAsia" w:hAnsiTheme="minorHAnsi" w:cstheme="minorBidi"/>
           <w:noProof/>
@@ -1538,7 +1966,7 @@
     </w:p>
     <w:p>
       <w:pPr>
-        <w:pStyle w:val="TOC2"/>
+        <w:pStyle w:val="Verzeichnis2"/>
         <w:rPr>
           <w:rFonts w:asciiTheme="minorHAnsi" w:eastAsiaTheme="minorEastAsia" w:hAnsiTheme="minorHAnsi" w:cstheme="minorBidi"/>
           <w:noProof/>
@@ -1634,7 +2062,7 @@
     </w:p>
     <w:p>
       <w:pPr>
-        <w:pStyle w:val="TOC2"/>
+        <w:pStyle w:val="Verzeichnis2"/>
         <w:rPr>
           <w:rFonts w:asciiTheme="minorHAnsi" w:eastAsiaTheme="minorEastAsia" w:hAnsiTheme="minorHAnsi" w:cstheme="minorBidi"/>
           <w:noProof/>
@@ -1724,10 +2152,10 @@
       <w:pPr>
         <w:pStyle w:val="Inhaltsverzeichnis"/>
         <w:sectPr>
-          <w:headerReference w:type="default" r:id="rId13"/>
-          <w:footerReference w:type="default" r:id="rId14"/>
-          <w:headerReference w:type="first" r:id="rId15"/>
-          <w:footerReference w:type="first" r:id="rId16"/>
+          <w:headerReference w:type="default" r:id="rId15"/>
+          <w:footerReference w:type="default" r:id="rId16"/>
+          <w:headerReference w:type="first" r:id="rId17"/>
+          <w:footerReference w:type="first" r:id="rId18"/>
           <w:pgSz w:w="11906" w:h="16838" w:code="9"/>
           <w:pgMar w:top="1418" w:right="1418" w:bottom="1418" w:left="1985" w:header="709" w:footer="709" w:gutter="0"/>
           <w:cols w:space="708"/>
@@ -1748,7 +2176,7 @@
     </w:p>
     <w:p>
       <w:pPr>
-        <w:pStyle w:val="Heading1"/>
+        <w:pStyle w:val="berschrift1"/>
         <w:numPr>
           <w:ilvl w:val="0"/>
           <w:numId w:val="0"/>
@@ -1959,7 +2387,7 @@
     <w:bookmarkEnd w:id="2"/>
     <w:p>
       <w:pPr>
-        <w:pStyle w:val="Heading1"/>
+        <w:pStyle w:val="berschrift1"/>
       </w:pPr>
       <w:r>
         <w:lastRenderedPageBreak/>
@@ -1968,7 +2396,7 @@
     </w:p>
     <w:p>
       <w:pPr>
-        <w:pStyle w:val="Heading2"/>
+        <w:pStyle w:val="berschrift2"/>
       </w:pPr>
       <w:bookmarkStart w:id="3" w:name="_Toc316629715"/>
       <w:bookmarkStart w:id="4" w:name="_Toc172211684"/>
@@ -1984,7 +2412,7 @@
     </w:p>
     <w:p>
       <w:pPr>
-        <w:pStyle w:val="Heading3"/>
+        <w:pStyle w:val="berschrift3"/>
       </w:pPr>
       <w:bookmarkStart w:id="6" w:name="_Toc316629716"/>
       <w:bookmarkStart w:id="7" w:name="_Toc172211685"/>
@@ -1999,12 +2427,12 @@
     </w:p>
     <w:p>
       <w:pPr>
-        <w:pStyle w:val="Caption"/>
-      </w:pPr>
-    </w:p>
-    <w:p>
-      <w:pPr>
-        <w:pStyle w:val="Caption"/>
+        <w:pStyle w:val="Beschriftung"/>
+      </w:pPr>
+    </w:p>
+    <w:p>
+      <w:pPr>
+        <w:pStyle w:val="Beschriftung"/>
       </w:pPr>
       <w:bookmarkStart w:id="8" w:name="_Ref172211528"/>
       <w:bookmarkStart w:id="9" w:name="_Toc349642378"/>
@@ -2049,15 +2477,7 @@
         <w:t>Verweise</w:t>
       </w:r>
       <w:r>
-        <w:t xml:space="preserve"> (</w:t>
-      </w:r>
-      <w:proofErr w:type="spellStart"/>
-      <w:r>
-        <w:t>engl</w:t>
-      </w:r>
-      <w:proofErr w:type="spellEnd"/>
-      <w:r>
-        <w:t>: References)</w:t>
+        <w:t xml:space="preserve"> (engl: References)</w:t>
       </w:r>
       <w:r>
         <w:t xml:space="preserve">, und klicken Sie dann auf die Symbolschaltfläche </w:t>
@@ -2070,15 +2490,7 @@
         <w:t>Beschriftung einfügen</w:t>
       </w:r>
       <w:r>
-        <w:t xml:space="preserve"> (</w:t>
-      </w:r>
-      <w:proofErr w:type="spellStart"/>
-      <w:r>
-        <w:t>engl</w:t>
-      </w:r>
-      <w:proofErr w:type="spellEnd"/>
-      <w:r>
-        <w:t>: Insert Caption)</w:t>
+        <w:t xml:space="preserve"> (engl: Insert Caption)</w:t>
       </w:r>
       <w:r>
         <w:t xml:space="preserve">, wählen </w:t>
@@ -2094,21 +2506,13 @@
         <w:t>Abbildung</w:t>
       </w:r>
       <w:r>
-        <w:t xml:space="preserve"> (</w:t>
-      </w:r>
-      <w:proofErr w:type="spellStart"/>
-      <w:r>
-        <w:t>engl</w:t>
-      </w:r>
-      <w:proofErr w:type="spellEnd"/>
-      <w:r>
-        <w:t>: Figures)</w:t>
+        <w:t xml:space="preserve"> (engl: Figures)</w:t>
       </w:r>
       <w:bookmarkEnd w:id="10"/>
     </w:p>
     <w:p>
       <w:pPr>
-        <w:pStyle w:val="BodyText"/>
+        <w:pStyle w:val="Textkrper"/>
       </w:pPr>
       <w:r>
         <w:rPr>
@@ -2130,7 +2534,7 @@
                     <pic:cNvPicPr/>
                   </pic:nvPicPr>
                   <pic:blipFill>
-                    <a:blip r:embed="rId17"/>
+                    <a:blip r:embed="rId19"/>
                     <a:stretch>
                       <a:fillRect/>
                     </a:stretch>
@@ -2153,12 +2557,12 @@
     </w:p>
     <w:p>
       <w:pPr>
-        <w:pStyle w:val="BodyText"/>
-      </w:pPr>
-    </w:p>
-    <w:p>
-      <w:pPr>
-        <w:pStyle w:val="Caption"/>
+        <w:pStyle w:val="Textkrper"/>
+      </w:pPr>
+    </w:p>
+    <w:p>
+      <w:pPr>
+        <w:pStyle w:val="Beschriftung"/>
       </w:pPr>
       <w:bookmarkStart w:id="11" w:name="_Toc172211700"/>
       <w:r>
@@ -2199,15 +2603,7 @@
         <w:t>Verweise</w:t>
       </w:r>
       <w:r>
-        <w:t xml:space="preserve"> (</w:t>
-      </w:r>
-      <w:proofErr w:type="spellStart"/>
-      <w:r>
-        <w:t>engl</w:t>
-      </w:r>
-      <w:proofErr w:type="spellEnd"/>
-      <w:r>
-        <w:t>: References)</w:t>
+        <w:t xml:space="preserve"> (engl: References)</w:t>
       </w:r>
       <w:r>
         <w:t xml:space="preserve">, und klicken Sie dann auf die Symbolschaltfläche </w:t>
@@ -2220,15 +2616,7 @@
         <w:t>Beschriftung einfügen</w:t>
       </w:r>
       <w:r>
-        <w:t xml:space="preserve"> (</w:t>
-      </w:r>
-      <w:proofErr w:type="spellStart"/>
-      <w:r>
-        <w:t>engl</w:t>
-      </w:r>
-      <w:proofErr w:type="spellEnd"/>
-      <w:r>
-        <w:t xml:space="preserve">: Insert Caption), wählen Sie </w:t>
+        <w:t xml:space="preserve"> (engl: Insert Caption), wählen Sie </w:t>
       </w:r>
       <w:r>
         <w:rPr>
@@ -2238,21 +2626,13 @@
         <w:t>Tabelle</w:t>
       </w:r>
       <w:r>
-        <w:t xml:space="preserve"> (</w:t>
-      </w:r>
-      <w:proofErr w:type="spellStart"/>
-      <w:r>
-        <w:t>engl</w:t>
-      </w:r>
-      <w:proofErr w:type="spellEnd"/>
-      <w:r>
-        <w:t>: Table)</w:t>
+        <w:t xml:space="preserve"> (engl: Table)</w:t>
       </w:r>
       <w:bookmarkEnd w:id="11"/>
     </w:p>
     <w:tbl>
       <w:tblPr>
-        <w:tblStyle w:val="TableGrid"/>
+        <w:tblStyle w:val="Tabellenraster"/>
         <w:tblW w:w="0" w:type="auto"/>
         <w:tblLook w:val="01E0" w:firstRow="1" w:lastRow="1" w:firstColumn="1" w:lastColumn="1" w:noHBand="0" w:noVBand="0"/>
       </w:tblPr>
@@ -2403,7 +2783,6 @@
       <w:r>
         <w:t xml:space="preserve">in der Menüleiste </w:t>
       </w:r>
-      <w:proofErr w:type="gramStart"/>
       <w:r>
         <w:t>zu</w:t>
       </w:r>
@@ -2417,20 +2796,11 @@
         </w:rPr>
         <w:t>Verweise</w:t>
       </w:r>
-      <w:proofErr w:type="gramEnd"/>
       <w:r>
         <w:t xml:space="preserve"> </w:t>
       </w:r>
       <w:r>
-        <w:t>(</w:t>
-      </w:r>
-      <w:proofErr w:type="spellStart"/>
-      <w:r>
-        <w:t>engl</w:t>
-      </w:r>
-      <w:proofErr w:type="spellEnd"/>
-      <w:r>
-        <w:t xml:space="preserve">: „References“) </w:t>
+        <w:t xml:space="preserve">(engl: „References“) </w:t>
       </w:r>
       <w:r>
         <w:t>gehen</w:t>
@@ -2446,15 +2816,7 @@
         <w:t>Querverweis</w:t>
       </w:r>
       <w:r>
-        <w:t xml:space="preserve"> (engl.: „Cross-</w:t>
-      </w:r>
-      <w:proofErr w:type="spellStart"/>
-      <w:r>
-        <w:t>references</w:t>
-      </w:r>
-      <w:proofErr w:type="spellEnd"/>
-      <w:r>
-        <w:t>“)</w:t>
+        <w:t xml:space="preserve"> (engl.: „Cross-references“)</w:t>
       </w:r>
       <w:r>
         <w:t>. Dort wählen Sie die Abbildung, die Tabelle oder auch eine korrekt formatierte Überschrift etc. und entscheiden, welche Form vom Querverweis (komplette Angabe, Seitenzahl o.ä.) Sie wünschen.</w:t>
@@ -2471,7 +2833,7 @@
     <w:p/>
     <w:p>
       <w:pPr>
-        <w:pStyle w:val="Heading1"/>
+        <w:pStyle w:val="berschrift1"/>
       </w:pPr>
       <w:bookmarkStart w:id="12" w:name="_Toc316629723"/>
       <w:bookmarkStart w:id="13" w:name="_Toc172211690"/>
@@ -2499,37 +2861,20 @@
         <w:t>s</w:t>
       </w:r>
       <w:r>
+        <w:t xml:space="preserve"> Zotero als Referenzierungshilfe. Allfällige Kosten für Speicherung von Daten werden übernommen; es werden regelmässig Schulungen durch die Bibliotheken angeboten</w:t>
+      </w:r>
+      <w:r>
+        <w:t xml:space="preserve">. </w:t>
+      </w:r>
+      <w:r>
+        <w:t xml:space="preserve">Die </w:t>
+      </w:r>
+      <w:r>
+        <w:t>Schriftart</w:t>
+      </w:r>
+      <w:r>
         <w:t xml:space="preserve"> </w:t>
       </w:r>
-      <w:proofErr w:type="spellStart"/>
-      <w:r>
-        <w:t>Zotero</w:t>
-      </w:r>
-      <w:proofErr w:type="spellEnd"/>
-      <w:r>
-        <w:t xml:space="preserve"> als </w:t>
-      </w:r>
-      <w:proofErr w:type="spellStart"/>
-      <w:r>
-        <w:t>Referenzierungshilfe</w:t>
-      </w:r>
-      <w:proofErr w:type="spellEnd"/>
-      <w:r>
-        <w:t>. Allfällige Kosten für Speicherung von Daten werden übernommen; es werden regelmässig Schulungen durch die Bibliotheken angeboten</w:t>
-      </w:r>
-      <w:r>
-        <w:t xml:space="preserve">. </w:t>
-      </w:r>
-      <w:r>
-        <w:t xml:space="preserve">Die </w:t>
-      </w:r>
-      <w:r>
-        <w:t>Schriftart</w:t>
-      </w:r>
-      <w:r>
-        <w:t xml:space="preserve"> </w:t>
-      </w:r>
-      <w:proofErr w:type="spellStart"/>
       <w:r>
         <w:rPr>
           <w:i/>
@@ -2544,7 +2889,6 @@
         </w:rPr>
         <w:t>y</w:t>
       </w:r>
-      <w:proofErr w:type="spellEnd"/>
       <w:r>
         <w:t xml:space="preserve"> ist mit Einzug </w:t>
       </w:r>
@@ -2560,19 +2904,19 @@
     </w:p>
     <w:p>
       <w:pPr>
-        <w:pStyle w:val="Bibliography"/>
+        <w:pStyle w:val="Literaturverzeichnis"/>
         <w:ind w:left="0" w:firstLine="0"/>
       </w:pPr>
     </w:p>
     <w:p>
       <w:pPr>
-        <w:pStyle w:val="Bibliography"/>
+        <w:pStyle w:val="Literaturverzeichnis"/>
         <w:ind w:left="0" w:firstLine="0"/>
       </w:pPr>
     </w:p>
     <w:p>
       <w:pPr>
-        <w:pStyle w:val="Bibliography"/>
+        <w:pStyle w:val="Literaturverzeichnis"/>
       </w:pPr>
     </w:p>
     <w:p>
@@ -2588,7 +2932,7 @@
     </w:p>
     <w:p>
       <w:pPr>
-        <w:pStyle w:val="Heading1"/>
+        <w:pStyle w:val="berschrift1"/>
       </w:pPr>
       <w:bookmarkStart w:id="14" w:name="_Toc316629724"/>
       <w:bookmarkStart w:id="15" w:name="_Toc172211691"/>
@@ -2601,7 +2945,7 @@
     </w:p>
     <w:p>
       <w:pPr>
-        <w:pStyle w:val="BodyText"/>
+        <w:pStyle w:val="Textkrper"/>
       </w:pPr>
       <w:r>
         <w:t xml:space="preserve">(Das Abbildungsverzeichnis wird automatisch </w:t>
@@ -2648,7 +2992,7 @@
     </w:p>
     <w:p>
       <w:pPr>
-        <w:pStyle w:val="TableofFigures"/>
+        <w:pStyle w:val="Abbildungsverzeichnis"/>
         <w:tabs>
           <w:tab w:val="right" w:leader="dot" w:pos="8493"/>
         </w:tabs>
@@ -2729,7 +3073,7 @@
     </w:p>
     <w:p>
       <w:pPr>
-        <w:pStyle w:val="TableofFigures"/>
+        <w:pStyle w:val="Abbildungsverzeichnis"/>
         <w:tabs>
           <w:tab w:val="right" w:leader="dot" w:pos="8493"/>
         </w:tabs>
@@ -2743,12 +3087,12 @@
     </w:p>
     <w:p>
       <w:pPr>
-        <w:pStyle w:val="BodyText"/>
-      </w:pPr>
-    </w:p>
-    <w:p>
-      <w:pPr>
-        <w:pStyle w:val="Heading1"/>
+        <w:pStyle w:val="Textkrper"/>
+      </w:pPr>
+    </w:p>
+    <w:p>
+      <w:pPr>
+        <w:pStyle w:val="berschrift1"/>
         <w:sectPr>
           <w:pgSz w:w="11906" w:h="16838" w:code="9"/>
           <w:pgMar w:top="1418" w:right="1418" w:bottom="1418" w:left="1985" w:header="709" w:footer="709" w:gutter="0"/>
@@ -2760,7 +3104,7 @@
     </w:p>
     <w:p>
       <w:pPr>
-        <w:pStyle w:val="Heading1"/>
+        <w:pStyle w:val="berschrift1"/>
       </w:pPr>
       <w:bookmarkStart w:id="16" w:name="_Toc316629725"/>
       <w:bookmarkStart w:id="17" w:name="_Toc172211692"/>
@@ -2773,7 +3117,7 @@
     </w:p>
     <w:p>
       <w:pPr>
-        <w:pStyle w:val="TableofFigures"/>
+        <w:pStyle w:val="Abbildungsverzeichnis"/>
         <w:tabs>
           <w:tab w:val="right" w:leader="dot" w:pos="8493"/>
         </w:tabs>
@@ -2859,7 +3203,7 @@
     </w:p>
     <w:p>
       <w:pPr>
-        <w:pStyle w:val="Heading1"/>
+        <w:pStyle w:val="berschrift1"/>
         <w:sectPr>
           <w:pgSz w:w="11906" w:h="16838" w:code="9"/>
           <w:pgMar w:top="1418" w:right="1418" w:bottom="1418" w:left="1985" w:header="709" w:footer="709" w:gutter="0"/>
@@ -2871,7 +3215,7 @@
     </w:p>
     <w:p>
       <w:pPr>
-        <w:pStyle w:val="Heading1"/>
+        <w:pStyle w:val="berschrift1"/>
       </w:pPr>
       <w:bookmarkStart w:id="18" w:name="_Toc316629726"/>
       <w:bookmarkStart w:id="19" w:name="_Toc172211693"/>
@@ -2884,7 +3228,7 @@
     </w:p>
     <w:tbl>
       <w:tblPr>
-        <w:tblStyle w:val="TableGrid"/>
+        <w:tblStyle w:val="Tabellenraster"/>
         <w:tblW w:w="0" w:type="auto"/>
         <w:tblBorders>
           <w:top w:val="none" w:sz="0" w:space="0" w:color="auto"/>
@@ -2907,7 +3251,7 @@
           </w:tcPr>
           <w:p>
             <w:pPr>
-              <w:pStyle w:val="BodyText"/>
+              <w:pStyle w:val="Textkrper"/>
               <w:rPr>
                 <w:sz w:val="16"/>
                 <w:szCs w:val="16"/>
@@ -2921,7 +3265,7 @@
           </w:tcPr>
           <w:p>
             <w:pPr>
-              <w:pStyle w:val="BodyText"/>
+              <w:pStyle w:val="Textkrper"/>
               <w:rPr>
                 <w:sz w:val="16"/>
                 <w:szCs w:val="16"/>
@@ -2937,7 +3281,7 @@
           </w:tcPr>
           <w:p>
             <w:pPr>
-              <w:pStyle w:val="BodyText"/>
+              <w:pStyle w:val="Textkrper"/>
               <w:rPr>
                 <w:sz w:val="16"/>
                 <w:szCs w:val="16"/>
@@ -2951,7 +3295,7 @@
           </w:tcPr>
           <w:p>
             <w:pPr>
-              <w:pStyle w:val="BodyText"/>
+              <w:pStyle w:val="Textkrper"/>
               <w:rPr>
                 <w:sz w:val="16"/>
                 <w:szCs w:val="16"/>
@@ -2963,17 +3307,17 @@
     </w:tbl>
     <w:p>
       <w:pPr>
-        <w:pStyle w:val="BodyText"/>
-      </w:pPr>
-    </w:p>
-    <w:p>
-      <w:pPr>
-        <w:pStyle w:val="BodyText"/>
-      </w:pPr>
-    </w:p>
-    <w:p>
-      <w:pPr>
-        <w:pStyle w:val="BodyText"/>
+        <w:pStyle w:val="Textkrper"/>
+      </w:pPr>
+    </w:p>
+    <w:p>
+      <w:pPr>
+        <w:pStyle w:val="Textkrper"/>
+      </w:pPr>
+    </w:p>
+    <w:p>
+      <w:pPr>
+        <w:pStyle w:val="Textkrper"/>
         <w:sectPr>
           <w:pgSz w:w="11906" w:h="16838" w:code="9"/>
           <w:pgMar w:top="1418" w:right="1418" w:bottom="1418" w:left="1985" w:header="709" w:footer="709" w:gutter="0"/>
@@ -2985,7 +3329,7 @@
     </w:p>
     <w:p>
       <w:pPr>
-        <w:pStyle w:val="Heading1"/>
+        <w:pStyle w:val="berschrift1"/>
       </w:pPr>
       <w:bookmarkStart w:id="20" w:name="_Toc172211694"/>
       <w:r>
@@ -2996,7 +3340,7 @@
     </w:p>
     <w:tbl>
       <w:tblPr>
-        <w:tblStyle w:val="TableGrid"/>
+        <w:tblStyle w:val="Tabellenraster"/>
         <w:tblW w:w="0" w:type="auto"/>
         <w:tblBorders>
           <w:top w:val="none" w:sz="0" w:space="0" w:color="auto"/>
@@ -3020,7 +3364,7 @@
           </w:tcPr>
           <w:p>
             <w:pPr>
-              <w:pStyle w:val="BodyText"/>
+              <w:pStyle w:val="Textkrper"/>
               <w:rPr>
                 <w:b/>
                 <w:bCs/>
@@ -3045,7 +3389,7 @@
           </w:tcPr>
           <w:p>
             <w:pPr>
-              <w:pStyle w:val="BodyText"/>
+              <w:pStyle w:val="Textkrper"/>
               <w:rPr>
                 <w:b/>
                 <w:bCs/>
@@ -3070,7 +3414,7 @@
           </w:tcPr>
           <w:p>
             <w:pPr>
-              <w:pStyle w:val="BodyText"/>
+              <w:pStyle w:val="Textkrper"/>
               <w:rPr>
                 <w:b/>
                 <w:bCs/>
@@ -3097,7 +3441,7 @@
           </w:tcPr>
           <w:p>
             <w:pPr>
-              <w:pStyle w:val="BodyText"/>
+              <w:pStyle w:val="Textkrper"/>
               <w:rPr>
                 <w:sz w:val="16"/>
                 <w:szCs w:val="16"/>
@@ -3111,7 +3455,7 @@
           </w:tcPr>
           <w:p>
             <w:pPr>
-              <w:pStyle w:val="BodyText"/>
+              <w:pStyle w:val="Textkrper"/>
               <w:rPr>
                 <w:sz w:val="16"/>
                 <w:szCs w:val="16"/>
@@ -3125,7 +3469,7 @@
           </w:tcPr>
           <w:p>
             <w:pPr>
-              <w:pStyle w:val="BodyText"/>
+              <w:pStyle w:val="Textkrper"/>
               <w:rPr>
                 <w:sz w:val="16"/>
                 <w:szCs w:val="16"/>
@@ -3137,17 +3481,17 @@
     </w:tbl>
     <w:p>
       <w:pPr>
-        <w:pStyle w:val="BodyText"/>
-      </w:pPr>
-    </w:p>
-    <w:p>
-      <w:pPr>
-        <w:pStyle w:val="BodyText"/>
-      </w:pPr>
-    </w:p>
-    <w:p>
-      <w:pPr>
-        <w:pStyle w:val="BodyText"/>
+        <w:pStyle w:val="Textkrper"/>
+      </w:pPr>
+    </w:p>
+    <w:p>
+      <w:pPr>
+        <w:pStyle w:val="Textkrper"/>
+      </w:pPr>
+    </w:p>
+    <w:p>
+      <w:pPr>
+        <w:pStyle w:val="Textkrper"/>
         <w:sectPr>
           <w:pgSz w:w="11906" w:h="16838" w:code="9"/>
           <w:pgMar w:top="1418" w:right="1418" w:bottom="1418" w:left="1985" w:header="709" w:footer="709" w:gutter="0"/>
@@ -3159,7 +3503,7 @@
     </w:p>
     <w:p>
       <w:pPr>
-        <w:pStyle w:val="Heading1"/>
+        <w:pStyle w:val="berschrift1"/>
       </w:pPr>
       <w:bookmarkStart w:id="21" w:name="_Toc316629727"/>
       <w:bookmarkStart w:id="22" w:name="_Toc172211695"/>
@@ -3172,7 +3516,7 @@
     </w:p>
     <w:p>
       <w:pPr>
-        <w:pStyle w:val="Heading2"/>
+        <w:pStyle w:val="berschrift2"/>
       </w:pPr>
       <w:bookmarkStart w:id="23" w:name="_Toc316629728"/>
       <w:bookmarkStart w:id="24" w:name="_Toc172211696"/>
@@ -3188,28 +3532,23 @@
         <w:t>s</w:t>
       </w:r>
       <w:r>
-        <w:t xml:space="preserve"> </w:t>
-      </w:r>
-      <w:proofErr w:type="spellStart"/>
-      <w:r>
-        <w:t>Anhang</w:t>
+        <w:t xml:space="preserve"> Anhang</w:t>
       </w:r>
       <w:r>
         <w:t>skapitel</w:t>
       </w:r>
-      <w:proofErr w:type="spellEnd"/>
       <w:r>
         <w:t xml:space="preserve"> beginnt auf einer neuen Seite</w:t>
       </w:r>
     </w:p>
     <w:p>
       <w:pPr>
-        <w:pStyle w:val="BodyText"/>
-      </w:pPr>
-    </w:p>
-    <w:p>
-      <w:pPr>
-        <w:pStyle w:val="Heading2"/>
+        <w:pStyle w:val="Textkrper"/>
+      </w:pPr>
+    </w:p>
+    <w:p>
+      <w:pPr>
+        <w:pStyle w:val="berschrift2"/>
       </w:pPr>
       <w:bookmarkStart w:id="25" w:name="_Toc316629729"/>
       <w:bookmarkStart w:id="26" w:name="_Toc172211697"/>
@@ -3288,7 +3627,7 @@
     </w:p>
     <w:p>
       <w:pPr>
-        <w:pStyle w:val="BodyText"/>
+        <w:pStyle w:val="Textkrper"/>
       </w:pPr>
       <w:r>
         <w:t>Bitte stellen Sie die individuelle Verantwortung pro Stud</w:t>
@@ -3305,7 +3644,7 @@
     </w:p>
     <w:tbl>
       <w:tblPr>
-        <w:tblStyle w:val="TableGrid"/>
+        <w:tblStyle w:val="Tabellenraster"/>
         <w:tblW w:w="8505" w:type="dxa"/>
         <w:tblBorders>
           <w:top w:val="none" w:sz="0" w:space="0" w:color="auto"/>
@@ -3328,7 +3667,7 @@
           </w:tcPr>
           <w:p>
             <w:pPr>
-              <w:pStyle w:val="BodyText"/>
+              <w:pStyle w:val="Textkrper"/>
               <w:rPr>
                 <w:b/>
                 <w:bCs/>
@@ -3362,7 +3701,7 @@
           </w:tcPr>
           <w:p>
             <w:pPr>
-              <w:pStyle w:val="BodyText"/>
+              <w:pStyle w:val="Textkrper"/>
               <w:rPr>
                 <w:b/>
                 <w:bCs/>
@@ -3389,7 +3728,7 @@
           </w:tcPr>
           <w:p>
             <w:pPr>
-              <w:pStyle w:val="BodyText"/>
+              <w:pStyle w:val="Textkrper"/>
               <w:rPr>
                 <w:sz w:val="16"/>
                 <w:szCs w:val="16"/>
@@ -3403,7 +3742,7 @@
           </w:tcPr>
           <w:p>
             <w:pPr>
-              <w:pStyle w:val="BodyText"/>
+              <w:pStyle w:val="Textkrper"/>
               <w:rPr>
                 <w:sz w:val="16"/>
                 <w:szCs w:val="16"/>
@@ -3415,7 +3754,7 @@
     </w:tbl>
     <w:p>
       <w:pPr>
-        <w:pStyle w:val="BodyText"/>
+        <w:pStyle w:val="Textkrper"/>
       </w:pPr>
     </w:p>
     <w:p>
@@ -3428,7 +3767,7 @@
     </w:p>
     <w:p>
       <w:pPr>
-        <w:pStyle w:val="Heading2"/>
+        <w:pStyle w:val="berschrift2"/>
         <w:tabs>
           <w:tab w:val="clear" w:pos="902"/>
           <w:tab w:val="num" w:pos="900"/>
@@ -4107,7 +4446,7 @@
     </w:p>
     <w:p>
       <w:pPr>
-        <w:pStyle w:val="BodyText"/>
+        <w:pStyle w:val="Textkrper"/>
       </w:pPr>
     </w:p>
     <w:sectPr>
@@ -4122,7 +4461,7 @@
 </file>
 
 <file path=word/endnotes.xml><?xml version="1.0" encoding="utf-8"?>
-<w:endnotes xmlns:wpc="http://schemas.microsoft.com/office/word/2010/wordprocessingCanvas" xmlns:cx="http://schemas.microsoft.com/office/drawing/2014/chartex" xmlns:cx1="http://schemas.microsoft.com/office/drawing/2015/9/8/chartex" xmlns:cx2="http://schemas.microsoft.com/office/drawing/2015/10/21/chartex" xmlns:cx3="http://schemas.microsoft.com/office/drawing/2016/5/9/chartex" xmlns:cx4="http://schemas.microsoft.com/office/drawing/2016/5/10/chartex" xmlns:cx5="http://schemas.microsoft.com/office/drawing/2016/5/11/chartex" xmlns:cx6="http://schemas.microsoft.com/office/drawing/2016/5/12/chartex" xmlns:cx7="http://schemas.microsoft.com/office/drawing/2016/5/13/chartex" xmlns:cx8="http://schemas.microsoft.com/office/drawing/2016/5/14/chartex" xmlns:mc="http://schemas.openxmlformats.org/markup-compatibility/2006" xmlns:aink="http://schemas.microsoft.com/office/drawing/2016/ink" xmlns:am3d="http://schemas.microsoft.com/office/drawing/2017/model3d" xmlns:o="urn:schemas-microsoft-com:office:office" xmlns:oel="http://schemas.microsoft.com/office/2019/extlst" xmlns:r="http://schemas.openxmlformats.org/officeDocument/2006/relationships" xmlns:m="http://schemas.openxmlformats.org/officeDocument/2006/math" xmlns:v="urn:schemas-microsoft-com:vml" xmlns:wp14="http://schemas.microsoft.com/office/word/2010/wordprocessingDrawing" xmlns:wp="http://schemas.openxmlformats.org/drawingml/2006/wordprocessingDrawing" xmlns:w10="urn:schemas-microsoft-com:office:word" xmlns:w="http://schemas.openxmlformats.org/wordprocessingml/2006/main" xmlns:w14="http://schemas.microsoft.com/office/word/2010/wordml" xmlns:w15="http://schemas.microsoft.com/office/word/2012/wordml" xmlns:w16cex="http://schemas.microsoft.com/office/word/2018/wordml/cex" xmlns:w16cid="http://schemas.microsoft.com/office/word/2016/wordml/cid" xmlns:w16="http://schemas.microsoft.com/office/word/2018/wordml" xmlns:w16du="http://schemas.microsoft.com/office/word/2023/wordml/word16du" xmlns:w16sdtdh="http://schemas.microsoft.com/office/word/2020/wordml/sdtdatahash" xmlns:w16sdtfl="http://schemas.microsoft.com/office/word/2024/wordml/sdtformatlock" xmlns:w16se="http://schemas.microsoft.com/office/word/2015/wordml/symex" xmlns:wpg="http://schemas.microsoft.com/office/word/2010/wordprocessingGroup" xmlns:wpi="http://schemas.microsoft.com/office/word/2010/wordprocessingInk" xmlns:wne="http://schemas.microsoft.com/office/word/2006/wordml" xmlns:wps="http://schemas.microsoft.com/office/word/2010/wordprocessingShape" mc:Ignorable="w14 w15 w16se w16cid w16 w16cex w16sdtdh w16sdtfl w16du wp14">
+<w:endnotes xmlns:wpc="http://schemas.microsoft.com/office/word/2010/wordprocessingCanvas" xmlns:cx="http://schemas.microsoft.com/office/drawing/2014/chartex" xmlns:cx1="http://schemas.microsoft.com/office/drawing/2015/9/8/chartex" xmlns:cx2="http://schemas.microsoft.com/office/drawing/2015/10/21/chartex" xmlns:cx3="http://schemas.microsoft.com/office/drawing/2016/5/9/chartex" xmlns:cx4="http://schemas.microsoft.com/office/drawing/2016/5/10/chartex" xmlns:cx5="http://schemas.microsoft.com/office/drawing/2016/5/11/chartex" xmlns:cx6="http://schemas.microsoft.com/office/drawing/2016/5/12/chartex" xmlns:cx7="http://schemas.microsoft.com/office/drawing/2016/5/13/chartex" xmlns:cx8="http://schemas.microsoft.com/office/drawing/2016/5/14/chartex" xmlns:mc="http://schemas.openxmlformats.org/markup-compatibility/2006" xmlns:aink="http://schemas.microsoft.com/office/drawing/2016/ink" xmlns:am3d="http://schemas.microsoft.com/office/drawing/2017/model3d" xmlns:o="urn:schemas-microsoft-com:office:office" xmlns:oel="http://schemas.microsoft.com/office/2019/extlst" xmlns:r="http://schemas.openxmlformats.org/officeDocument/2006/relationships" xmlns:m="http://schemas.openxmlformats.org/officeDocument/2006/math" xmlns:v="urn:schemas-microsoft-com:vml" xmlns:wp14="http://schemas.microsoft.com/office/word/2010/wordprocessingDrawing" xmlns:wp="http://schemas.openxmlformats.org/drawingml/2006/wordprocessingDrawing" xmlns:w10="urn:schemas-microsoft-com:office:word" xmlns:w="http://schemas.openxmlformats.org/wordprocessingml/2006/main" xmlns:w14="http://schemas.microsoft.com/office/word/2010/wordml" xmlns:w15="http://schemas.microsoft.com/office/word/2012/wordml" xmlns:w16cex="http://schemas.microsoft.com/office/word/2018/wordml/cex" xmlns:w16cid="http://schemas.microsoft.com/office/word/2016/wordml/cid" xmlns:w16="http://schemas.microsoft.com/office/word/2018/wordml" xmlns:w16sdtdh="http://schemas.microsoft.com/office/word/2020/wordml/sdtdatahash" xmlns:w16se="http://schemas.microsoft.com/office/word/2015/wordml/symex" xmlns:wpg="http://schemas.microsoft.com/office/word/2010/wordprocessingGroup" xmlns:wpi="http://schemas.microsoft.com/office/word/2010/wordprocessingInk" xmlns:wne="http://schemas.microsoft.com/office/word/2006/wordml" xmlns:wps="http://schemas.microsoft.com/office/word/2010/wordprocessingShape" mc:Ignorable="w14 w15 w16se w16cid w16 w16cex w16sdtdh wp14">
   <w:endnote w:type="separator" w:id="-1">
     <w:p>
       <w:pPr>
@@ -4154,39 +4493,100 @@
 </file>
 
 <file path=word/footer1.xml><?xml version="1.0" encoding="utf-8"?>
-<w:ftr xmlns:wpc="http://schemas.microsoft.com/office/word/2010/wordprocessingCanvas" xmlns:cx="http://schemas.microsoft.com/office/drawing/2014/chartex" xmlns:cx1="http://schemas.microsoft.com/office/drawing/2015/9/8/chartex" xmlns:cx2="http://schemas.microsoft.com/office/drawing/2015/10/21/chartex" xmlns:cx3="http://schemas.microsoft.com/office/drawing/2016/5/9/chartex" xmlns:cx4="http://schemas.microsoft.com/office/drawing/2016/5/10/chartex" xmlns:cx5="http://schemas.microsoft.com/office/drawing/2016/5/11/chartex" xmlns:cx6="http://schemas.microsoft.com/office/drawing/2016/5/12/chartex" xmlns:cx7="http://schemas.microsoft.com/office/drawing/2016/5/13/chartex" xmlns:cx8="http://schemas.microsoft.com/office/drawing/2016/5/14/chartex" xmlns:mc="http://schemas.openxmlformats.org/markup-compatibility/2006" xmlns:aink="http://schemas.microsoft.com/office/drawing/2016/ink" xmlns:am3d="http://schemas.microsoft.com/office/drawing/2017/model3d" xmlns:o="urn:schemas-microsoft-com:office:office" xmlns:oel="http://schemas.microsoft.com/office/2019/extlst" xmlns:r="http://schemas.openxmlformats.org/officeDocument/2006/relationships" xmlns:m="http://schemas.openxmlformats.org/officeDocument/2006/math" xmlns:v="urn:schemas-microsoft-com:vml" xmlns:wp14="http://schemas.microsoft.com/office/word/2010/wordprocessingDrawing" xmlns:wp="http://schemas.openxmlformats.org/drawingml/2006/wordprocessingDrawing" xmlns:w10="urn:schemas-microsoft-com:office:word" xmlns:w="http://schemas.openxmlformats.org/wordprocessingml/2006/main" xmlns:w14="http://schemas.microsoft.com/office/word/2010/wordml" xmlns:w15="http://schemas.microsoft.com/office/word/2012/wordml" xmlns:w16cex="http://schemas.microsoft.com/office/word/2018/wordml/cex" xmlns:w16cid="http://schemas.microsoft.com/office/word/2016/wordml/cid" xmlns:w16="http://schemas.microsoft.com/office/word/2018/wordml" xmlns:w16du="http://schemas.microsoft.com/office/word/2023/wordml/word16du" xmlns:w16sdtdh="http://schemas.microsoft.com/office/word/2020/wordml/sdtdatahash" xmlns:w16sdtfl="http://schemas.microsoft.com/office/word/2024/wordml/sdtformatlock" xmlns:w16se="http://schemas.microsoft.com/office/word/2015/wordml/symex" xmlns:wpg="http://schemas.microsoft.com/office/word/2010/wordprocessingGroup" xmlns:wpi="http://schemas.microsoft.com/office/word/2010/wordprocessingInk" xmlns:wne="http://schemas.microsoft.com/office/word/2006/wordml" xmlns:wps="http://schemas.microsoft.com/office/word/2010/wordprocessingShape" mc:Ignorable="w14 w15 w16se w16cid w16 w16cex w16sdtdh w16sdtfl w16du wp14">
+<w:ftr xmlns:wpc="http://schemas.microsoft.com/office/word/2010/wordprocessingCanvas" xmlns:cx="http://schemas.microsoft.com/office/drawing/2014/chartex" xmlns:cx1="http://schemas.microsoft.com/office/drawing/2015/9/8/chartex" xmlns:cx2="http://schemas.microsoft.com/office/drawing/2015/10/21/chartex" xmlns:cx3="http://schemas.microsoft.com/office/drawing/2016/5/9/chartex" xmlns:cx4="http://schemas.microsoft.com/office/drawing/2016/5/10/chartex" xmlns:cx5="http://schemas.microsoft.com/office/drawing/2016/5/11/chartex" xmlns:cx6="http://schemas.microsoft.com/office/drawing/2016/5/12/chartex" xmlns:cx7="http://schemas.microsoft.com/office/drawing/2016/5/13/chartex" xmlns:cx8="http://schemas.microsoft.com/office/drawing/2016/5/14/chartex" xmlns:mc="http://schemas.openxmlformats.org/markup-compatibility/2006" xmlns:aink="http://schemas.microsoft.com/office/drawing/2016/ink" xmlns:am3d="http://schemas.microsoft.com/office/drawing/2017/model3d" xmlns:o="urn:schemas-microsoft-com:office:office" xmlns:oel="http://schemas.microsoft.com/office/2019/extlst" xmlns:r="http://schemas.openxmlformats.org/officeDocument/2006/relationships" xmlns:m="http://schemas.openxmlformats.org/officeDocument/2006/math" xmlns:v="urn:schemas-microsoft-com:vml" xmlns:wp14="http://schemas.microsoft.com/office/word/2010/wordprocessingDrawing" xmlns:wp="http://schemas.openxmlformats.org/drawingml/2006/wordprocessingDrawing" xmlns:w10="urn:schemas-microsoft-com:office:word" xmlns:w="http://schemas.openxmlformats.org/wordprocessingml/2006/main" xmlns:w14="http://schemas.microsoft.com/office/word/2010/wordml" xmlns:w15="http://schemas.microsoft.com/office/word/2012/wordml" xmlns:w16cex="http://schemas.microsoft.com/office/word/2018/wordml/cex" xmlns:w16cid="http://schemas.microsoft.com/office/word/2016/wordml/cid" xmlns:w16="http://schemas.microsoft.com/office/word/2018/wordml" xmlns:w16sdtdh="http://schemas.microsoft.com/office/word/2020/wordml/sdtdatahash" xmlns:w16se="http://schemas.microsoft.com/office/word/2015/wordml/symex" xmlns:wpg="http://schemas.microsoft.com/office/word/2010/wordprocessingGroup" xmlns:wpi="http://schemas.microsoft.com/office/word/2010/wordprocessingInk" xmlns:wne="http://schemas.microsoft.com/office/word/2006/wordml" xmlns:wps="http://schemas.microsoft.com/office/word/2010/wordprocessingShape" mc:Ignorable="w14 w15 w16se w16cid w16 w16cex w16sdtdh wp14">
+  <w:tbl>
+    <w:tblPr>
+      <w:tblW w:w="0" w:type="auto"/>
+      <w:tblLayout w:type="fixed"/>
+      <w:tblLook w:val="06A0" w:firstRow="1" w:lastRow="0" w:firstColumn="1" w:lastColumn="0" w:noHBand="1" w:noVBand="1"/>
+    </w:tblPr>
+    <w:tblGrid>
+      <w:gridCol w:w="2830"/>
+      <w:gridCol w:w="2830"/>
+      <w:gridCol w:w="2830"/>
+    </w:tblGrid>
+    <w:tr>
+      <w:trPr>
+        <w:trHeight w:val="300"/>
+      </w:trPr>
+      <w:tc>
+        <w:tcPr>
+          <w:tcW w:w="2830" w:type="dxa"/>
+        </w:tcPr>
+        <w:p>
+          <w:pPr>
+            <w:pStyle w:val="Kopfzeile"/>
+            <w:ind w:left="-115"/>
+            <w:jc w:val="left"/>
+          </w:pPr>
+        </w:p>
+      </w:tc>
+      <w:tc>
+        <w:tcPr>
+          <w:tcW w:w="2830" w:type="dxa"/>
+        </w:tcPr>
+        <w:p>
+          <w:pPr>
+            <w:pStyle w:val="Kopfzeile"/>
+            <w:jc w:val="center"/>
+          </w:pPr>
+        </w:p>
+      </w:tc>
+      <w:tc>
+        <w:tcPr>
+          <w:tcW w:w="2830" w:type="dxa"/>
+        </w:tcPr>
+        <w:p>
+          <w:pPr>
+            <w:pStyle w:val="Kopfzeile"/>
+            <w:ind w:right="-115"/>
+          </w:pPr>
+        </w:p>
+      </w:tc>
+    </w:tr>
+  </w:tbl>
   <w:p>
     <w:pPr>
-      <w:pStyle w:val="Footer"/>
+      <w:pStyle w:val="Fuzeile"/>
+    </w:pPr>
+  </w:p>
+</w:ftr>
+</file>
+
+<file path=word/footer2.xml><?xml version="1.0" encoding="utf-8"?>
+<w:ftr xmlns:wpc="http://schemas.microsoft.com/office/word/2010/wordprocessingCanvas" xmlns:cx="http://schemas.microsoft.com/office/drawing/2014/chartex" xmlns:cx1="http://schemas.microsoft.com/office/drawing/2015/9/8/chartex" xmlns:cx2="http://schemas.microsoft.com/office/drawing/2015/10/21/chartex" xmlns:cx3="http://schemas.microsoft.com/office/drawing/2016/5/9/chartex" xmlns:cx4="http://schemas.microsoft.com/office/drawing/2016/5/10/chartex" xmlns:cx5="http://schemas.microsoft.com/office/drawing/2016/5/11/chartex" xmlns:cx6="http://schemas.microsoft.com/office/drawing/2016/5/12/chartex" xmlns:cx7="http://schemas.microsoft.com/office/drawing/2016/5/13/chartex" xmlns:cx8="http://schemas.microsoft.com/office/drawing/2016/5/14/chartex" xmlns:mc="http://schemas.openxmlformats.org/markup-compatibility/2006" xmlns:aink="http://schemas.microsoft.com/office/drawing/2016/ink" xmlns:am3d="http://schemas.microsoft.com/office/drawing/2017/model3d" xmlns:o="urn:schemas-microsoft-com:office:office" xmlns:oel="http://schemas.microsoft.com/office/2019/extlst" xmlns:r="http://schemas.openxmlformats.org/officeDocument/2006/relationships" xmlns:m="http://schemas.openxmlformats.org/officeDocument/2006/math" xmlns:v="urn:schemas-microsoft-com:vml" xmlns:wp14="http://schemas.microsoft.com/office/word/2010/wordprocessingDrawing" xmlns:wp="http://schemas.openxmlformats.org/drawingml/2006/wordprocessingDrawing" xmlns:w10="urn:schemas-microsoft-com:office:word" xmlns:w="http://schemas.openxmlformats.org/wordprocessingml/2006/main" xmlns:w14="http://schemas.microsoft.com/office/word/2010/wordml" xmlns:w15="http://schemas.microsoft.com/office/word/2012/wordml" xmlns:w16cex="http://schemas.microsoft.com/office/word/2018/wordml/cex" xmlns:w16cid="http://schemas.microsoft.com/office/word/2016/wordml/cid" xmlns:w16="http://schemas.microsoft.com/office/word/2018/wordml" xmlns:w16sdtdh="http://schemas.microsoft.com/office/word/2020/wordml/sdtdatahash" xmlns:w16se="http://schemas.microsoft.com/office/word/2015/wordml/symex" xmlns:wpg="http://schemas.microsoft.com/office/word/2010/wordprocessingGroup" xmlns:wpi="http://schemas.microsoft.com/office/word/2010/wordprocessingInk" xmlns:wne="http://schemas.microsoft.com/office/word/2006/wordml" xmlns:wps="http://schemas.microsoft.com/office/word/2010/wordprocessingShape" mc:Ignorable="w14 w15 w16se w16cid w16 w16cex w16sdtdh wp14">
+  <w:p>
+    <w:pPr>
+      <w:pStyle w:val="Fuzeile"/>
     </w:pPr>
     <w:r>
       <w:rPr>
-        <w:rStyle w:val="PageNumber"/>
+        <w:rStyle w:val="Seitenzahl"/>
       </w:rPr>
       <w:fldChar w:fldCharType="begin"/>
     </w:r>
     <w:r>
       <w:rPr>
-        <w:rStyle w:val="PageNumber"/>
+        <w:rStyle w:val="Seitenzahl"/>
       </w:rPr>
       <w:instrText xml:space="preserve"> PAGE </w:instrText>
     </w:r>
     <w:r>
       <w:rPr>
-        <w:rStyle w:val="PageNumber"/>
+        <w:rStyle w:val="Seitenzahl"/>
       </w:rPr>
       <w:fldChar w:fldCharType="separate"/>
     </w:r>
     <w:r>
       <w:rPr>
-        <w:rStyle w:val="PageNumber"/>
+        <w:rStyle w:val="Seitenzahl"/>
         <w:noProof/>
       </w:rPr>
       <w:t>10</w:t>
     </w:r>
     <w:r>
       <w:rPr>
-        <w:rStyle w:val="PageNumber"/>
+        <w:rStyle w:val="Seitenzahl"/>
       </w:rPr>
       <w:fldChar w:fldCharType="end"/>
     </w:r>
@@ -4194,40 +4594,40 @@
 </w:ftr>
 </file>
 
-<file path=word/footer2.xml><?xml version="1.0" encoding="utf-8"?>
-<w:ftr xmlns:wpc="http://schemas.microsoft.com/office/word/2010/wordprocessingCanvas" xmlns:cx="http://schemas.microsoft.com/office/drawing/2014/chartex" xmlns:cx1="http://schemas.microsoft.com/office/drawing/2015/9/8/chartex" xmlns:cx2="http://schemas.microsoft.com/office/drawing/2015/10/21/chartex" xmlns:cx3="http://schemas.microsoft.com/office/drawing/2016/5/9/chartex" xmlns:cx4="http://schemas.microsoft.com/office/drawing/2016/5/10/chartex" xmlns:cx5="http://schemas.microsoft.com/office/drawing/2016/5/11/chartex" xmlns:cx6="http://schemas.microsoft.com/office/drawing/2016/5/12/chartex" xmlns:cx7="http://schemas.microsoft.com/office/drawing/2016/5/13/chartex" xmlns:cx8="http://schemas.microsoft.com/office/drawing/2016/5/14/chartex" xmlns:mc="http://schemas.openxmlformats.org/markup-compatibility/2006" xmlns:aink="http://schemas.microsoft.com/office/drawing/2016/ink" xmlns:am3d="http://schemas.microsoft.com/office/drawing/2017/model3d" xmlns:o="urn:schemas-microsoft-com:office:office" xmlns:oel="http://schemas.microsoft.com/office/2019/extlst" xmlns:r="http://schemas.openxmlformats.org/officeDocument/2006/relationships" xmlns:m="http://schemas.openxmlformats.org/officeDocument/2006/math" xmlns:v="urn:schemas-microsoft-com:vml" xmlns:wp14="http://schemas.microsoft.com/office/word/2010/wordprocessingDrawing" xmlns:wp="http://schemas.openxmlformats.org/drawingml/2006/wordprocessingDrawing" xmlns:w10="urn:schemas-microsoft-com:office:word" xmlns:w="http://schemas.openxmlformats.org/wordprocessingml/2006/main" xmlns:w14="http://schemas.microsoft.com/office/word/2010/wordml" xmlns:w15="http://schemas.microsoft.com/office/word/2012/wordml" xmlns:w16cex="http://schemas.microsoft.com/office/word/2018/wordml/cex" xmlns:w16cid="http://schemas.microsoft.com/office/word/2016/wordml/cid" xmlns:w16="http://schemas.microsoft.com/office/word/2018/wordml" xmlns:w16du="http://schemas.microsoft.com/office/word/2023/wordml/word16du" xmlns:w16sdtdh="http://schemas.microsoft.com/office/word/2020/wordml/sdtdatahash" xmlns:w16sdtfl="http://schemas.microsoft.com/office/word/2024/wordml/sdtformatlock" xmlns:w16se="http://schemas.microsoft.com/office/word/2015/wordml/symex" xmlns:wpg="http://schemas.microsoft.com/office/word/2010/wordprocessingGroup" xmlns:wpi="http://schemas.microsoft.com/office/word/2010/wordprocessingInk" xmlns:wne="http://schemas.microsoft.com/office/word/2006/wordml" xmlns:wps="http://schemas.microsoft.com/office/word/2010/wordprocessingShape" mc:Ignorable="w14 w15 w16se w16cid w16 w16cex w16sdtdh w16sdtfl w16du wp14">
+<file path=word/footer3.xml><?xml version="1.0" encoding="utf-8"?>
+<w:ftr xmlns:wpc="http://schemas.microsoft.com/office/word/2010/wordprocessingCanvas" xmlns:cx="http://schemas.microsoft.com/office/drawing/2014/chartex" xmlns:cx1="http://schemas.microsoft.com/office/drawing/2015/9/8/chartex" xmlns:cx2="http://schemas.microsoft.com/office/drawing/2015/10/21/chartex" xmlns:cx3="http://schemas.microsoft.com/office/drawing/2016/5/9/chartex" xmlns:cx4="http://schemas.microsoft.com/office/drawing/2016/5/10/chartex" xmlns:cx5="http://schemas.microsoft.com/office/drawing/2016/5/11/chartex" xmlns:cx6="http://schemas.microsoft.com/office/drawing/2016/5/12/chartex" xmlns:cx7="http://schemas.microsoft.com/office/drawing/2016/5/13/chartex" xmlns:cx8="http://schemas.microsoft.com/office/drawing/2016/5/14/chartex" xmlns:mc="http://schemas.openxmlformats.org/markup-compatibility/2006" xmlns:aink="http://schemas.microsoft.com/office/drawing/2016/ink" xmlns:am3d="http://schemas.microsoft.com/office/drawing/2017/model3d" xmlns:o="urn:schemas-microsoft-com:office:office" xmlns:oel="http://schemas.microsoft.com/office/2019/extlst" xmlns:r="http://schemas.openxmlformats.org/officeDocument/2006/relationships" xmlns:m="http://schemas.openxmlformats.org/officeDocument/2006/math" xmlns:v="urn:schemas-microsoft-com:vml" xmlns:wp14="http://schemas.microsoft.com/office/word/2010/wordprocessingDrawing" xmlns:wp="http://schemas.openxmlformats.org/drawingml/2006/wordprocessingDrawing" xmlns:w10="urn:schemas-microsoft-com:office:word" xmlns:w="http://schemas.openxmlformats.org/wordprocessingml/2006/main" xmlns:w14="http://schemas.microsoft.com/office/word/2010/wordml" xmlns:w15="http://schemas.microsoft.com/office/word/2012/wordml" xmlns:w16cex="http://schemas.microsoft.com/office/word/2018/wordml/cex" xmlns:w16cid="http://schemas.microsoft.com/office/word/2016/wordml/cid" xmlns:w16="http://schemas.microsoft.com/office/word/2018/wordml" xmlns:w16sdtdh="http://schemas.microsoft.com/office/word/2020/wordml/sdtdatahash" xmlns:w16se="http://schemas.microsoft.com/office/word/2015/wordml/symex" xmlns:wpg="http://schemas.microsoft.com/office/word/2010/wordprocessingGroup" xmlns:wpi="http://schemas.microsoft.com/office/word/2010/wordprocessingInk" xmlns:wne="http://schemas.microsoft.com/office/word/2006/wordml" xmlns:wps="http://schemas.microsoft.com/office/word/2010/wordprocessingShape" mc:Ignorable="w14 w15 w16se w16cid w16 w16cex w16sdtdh wp14">
   <w:p>
     <w:pPr>
-      <w:pStyle w:val="Footer"/>
+      <w:pStyle w:val="Fuzeile"/>
     </w:pPr>
     <w:r>
       <w:rPr>
-        <w:rStyle w:val="PageNumber"/>
+        <w:rStyle w:val="Seitenzahl"/>
       </w:rPr>
       <w:fldChar w:fldCharType="begin"/>
     </w:r>
     <w:r>
       <w:rPr>
-        <w:rStyle w:val="PageNumber"/>
+        <w:rStyle w:val="Seitenzahl"/>
       </w:rPr>
       <w:instrText xml:space="preserve"> PAGE </w:instrText>
     </w:r>
     <w:r>
       <w:rPr>
-        <w:rStyle w:val="PageNumber"/>
+        <w:rStyle w:val="Seitenzahl"/>
       </w:rPr>
       <w:fldChar w:fldCharType="separate"/>
     </w:r>
     <w:r>
       <w:rPr>
-        <w:rStyle w:val="PageNumber"/>
+        <w:rStyle w:val="Seitenzahl"/>
         <w:noProof/>
       </w:rPr>
       <w:t>2</w:t>
     </w:r>
     <w:r>
       <w:rPr>
-        <w:rStyle w:val="PageNumber"/>
+        <w:rStyle w:val="Seitenzahl"/>
       </w:rPr>
       <w:fldChar w:fldCharType="end"/>
     </w:r>
@@ -4236,7 +4636,7 @@
 </file>
 
 <file path=word/footnotes.xml><?xml version="1.0" encoding="utf-8"?>
-<w:footnotes xmlns:wpc="http://schemas.microsoft.com/office/word/2010/wordprocessingCanvas" xmlns:cx="http://schemas.microsoft.com/office/drawing/2014/chartex" xmlns:cx1="http://schemas.microsoft.com/office/drawing/2015/9/8/chartex" xmlns:cx2="http://schemas.microsoft.com/office/drawing/2015/10/21/chartex" xmlns:cx3="http://schemas.microsoft.com/office/drawing/2016/5/9/chartex" xmlns:cx4="http://schemas.microsoft.com/office/drawing/2016/5/10/chartex" xmlns:cx5="http://schemas.microsoft.com/office/drawing/2016/5/11/chartex" xmlns:cx6="http://schemas.microsoft.com/office/drawing/2016/5/12/chartex" xmlns:cx7="http://schemas.microsoft.com/office/drawing/2016/5/13/chartex" xmlns:cx8="http://schemas.microsoft.com/office/drawing/2016/5/14/chartex" xmlns:mc="http://schemas.openxmlformats.org/markup-compatibility/2006" xmlns:aink="http://schemas.microsoft.com/office/drawing/2016/ink" xmlns:am3d="http://schemas.microsoft.com/office/drawing/2017/model3d" xmlns:o="urn:schemas-microsoft-com:office:office" xmlns:oel="http://schemas.microsoft.com/office/2019/extlst" xmlns:r="http://schemas.openxmlformats.org/officeDocument/2006/relationships" xmlns:m="http://schemas.openxmlformats.org/officeDocument/2006/math" xmlns:v="urn:schemas-microsoft-com:vml" xmlns:wp14="http://schemas.microsoft.com/office/word/2010/wordprocessingDrawing" xmlns:wp="http://schemas.openxmlformats.org/drawingml/2006/wordprocessingDrawing" xmlns:w10="urn:schemas-microsoft-com:office:word" xmlns:w="http://schemas.openxmlformats.org/wordprocessingml/2006/main" xmlns:w14="http://schemas.microsoft.com/office/word/2010/wordml" xmlns:w15="http://schemas.microsoft.com/office/word/2012/wordml" xmlns:w16cex="http://schemas.microsoft.com/office/word/2018/wordml/cex" xmlns:w16cid="http://schemas.microsoft.com/office/word/2016/wordml/cid" xmlns:w16="http://schemas.microsoft.com/office/word/2018/wordml" xmlns:w16du="http://schemas.microsoft.com/office/word/2023/wordml/word16du" xmlns:w16sdtdh="http://schemas.microsoft.com/office/word/2020/wordml/sdtdatahash" xmlns:w16sdtfl="http://schemas.microsoft.com/office/word/2024/wordml/sdtformatlock" xmlns:w16se="http://schemas.microsoft.com/office/word/2015/wordml/symex" xmlns:wpg="http://schemas.microsoft.com/office/word/2010/wordprocessingGroup" xmlns:wpi="http://schemas.microsoft.com/office/word/2010/wordprocessingInk" xmlns:wne="http://schemas.microsoft.com/office/word/2006/wordml" xmlns:wps="http://schemas.microsoft.com/office/word/2010/wordprocessingShape" mc:Ignorable="w14 w15 w16se w16cid w16 w16cex w16sdtdh w16sdtfl w16du wp14">
+<w:footnotes xmlns:wpc="http://schemas.microsoft.com/office/word/2010/wordprocessingCanvas" xmlns:cx="http://schemas.microsoft.com/office/drawing/2014/chartex" xmlns:cx1="http://schemas.microsoft.com/office/drawing/2015/9/8/chartex" xmlns:cx2="http://schemas.microsoft.com/office/drawing/2015/10/21/chartex" xmlns:cx3="http://schemas.microsoft.com/office/drawing/2016/5/9/chartex" xmlns:cx4="http://schemas.microsoft.com/office/drawing/2016/5/10/chartex" xmlns:cx5="http://schemas.microsoft.com/office/drawing/2016/5/11/chartex" xmlns:cx6="http://schemas.microsoft.com/office/drawing/2016/5/12/chartex" xmlns:cx7="http://schemas.microsoft.com/office/drawing/2016/5/13/chartex" xmlns:cx8="http://schemas.microsoft.com/office/drawing/2016/5/14/chartex" xmlns:mc="http://schemas.openxmlformats.org/markup-compatibility/2006" xmlns:aink="http://schemas.microsoft.com/office/drawing/2016/ink" xmlns:am3d="http://schemas.microsoft.com/office/drawing/2017/model3d" xmlns:o="urn:schemas-microsoft-com:office:office" xmlns:oel="http://schemas.microsoft.com/office/2019/extlst" xmlns:r="http://schemas.openxmlformats.org/officeDocument/2006/relationships" xmlns:m="http://schemas.openxmlformats.org/officeDocument/2006/math" xmlns:v="urn:schemas-microsoft-com:vml" xmlns:wp14="http://schemas.microsoft.com/office/word/2010/wordprocessingDrawing" xmlns:wp="http://schemas.openxmlformats.org/drawingml/2006/wordprocessingDrawing" xmlns:w10="urn:schemas-microsoft-com:office:word" xmlns:w="http://schemas.openxmlformats.org/wordprocessingml/2006/main" xmlns:w14="http://schemas.microsoft.com/office/word/2010/wordml" xmlns:w15="http://schemas.microsoft.com/office/word/2012/wordml" xmlns:w16cex="http://schemas.microsoft.com/office/word/2018/wordml/cex" xmlns:w16cid="http://schemas.microsoft.com/office/word/2016/wordml/cid" xmlns:w16="http://schemas.microsoft.com/office/word/2018/wordml" xmlns:w16sdtdh="http://schemas.microsoft.com/office/word/2020/wordml/sdtdatahash" xmlns:w16se="http://schemas.microsoft.com/office/word/2015/wordml/symex" xmlns:wpg="http://schemas.microsoft.com/office/word/2010/wordprocessingGroup" xmlns:wpi="http://schemas.microsoft.com/office/word/2010/wordprocessingInk" xmlns:wne="http://schemas.microsoft.com/office/word/2006/wordml" xmlns:wps="http://schemas.microsoft.com/office/word/2010/wordprocessingShape" mc:Ignorable="w14 w15 w16se w16cid w16 w16cex w16sdtdh wp14">
   <w:footnote w:type="separator" w:id="-1">
     <w:p>
       <w:pPr>
@@ -4268,10 +4668,71 @@
 </file>
 
 <file path=word/header1.xml><?xml version="1.0" encoding="utf-8"?>
-<w:hdr xmlns:wpc="http://schemas.microsoft.com/office/word/2010/wordprocessingCanvas" xmlns:cx="http://schemas.microsoft.com/office/drawing/2014/chartex" xmlns:cx1="http://schemas.microsoft.com/office/drawing/2015/9/8/chartex" xmlns:cx2="http://schemas.microsoft.com/office/drawing/2015/10/21/chartex" xmlns:cx3="http://schemas.microsoft.com/office/drawing/2016/5/9/chartex" xmlns:cx4="http://schemas.microsoft.com/office/drawing/2016/5/10/chartex" xmlns:cx5="http://schemas.microsoft.com/office/drawing/2016/5/11/chartex" xmlns:cx6="http://schemas.microsoft.com/office/drawing/2016/5/12/chartex" xmlns:cx7="http://schemas.microsoft.com/office/drawing/2016/5/13/chartex" xmlns:cx8="http://schemas.microsoft.com/office/drawing/2016/5/14/chartex" xmlns:mc="http://schemas.openxmlformats.org/markup-compatibility/2006" xmlns:aink="http://schemas.microsoft.com/office/drawing/2016/ink" xmlns:am3d="http://schemas.microsoft.com/office/drawing/2017/model3d" xmlns:o="urn:schemas-microsoft-com:office:office" xmlns:oel="http://schemas.microsoft.com/office/2019/extlst" xmlns:r="http://schemas.openxmlformats.org/officeDocument/2006/relationships" xmlns:m="http://schemas.openxmlformats.org/officeDocument/2006/math" xmlns:v="urn:schemas-microsoft-com:vml" xmlns:wp14="http://schemas.microsoft.com/office/word/2010/wordprocessingDrawing" xmlns:wp="http://schemas.openxmlformats.org/drawingml/2006/wordprocessingDrawing" xmlns:w10="urn:schemas-microsoft-com:office:word" xmlns:w="http://schemas.openxmlformats.org/wordprocessingml/2006/main" xmlns:w14="http://schemas.microsoft.com/office/word/2010/wordml" xmlns:w15="http://schemas.microsoft.com/office/word/2012/wordml" xmlns:w16cex="http://schemas.microsoft.com/office/word/2018/wordml/cex" xmlns:w16cid="http://schemas.microsoft.com/office/word/2016/wordml/cid" xmlns:w16="http://schemas.microsoft.com/office/word/2018/wordml" xmlns:w16du="http://schemas.microsoft.com/office/word/2023/wordml/word16du" xmlns:w16sdtdh="http://schemas.microsoft.com/office/word/2020/wordml/sdtdatahash" xmlns:w16sdtfl="http://schemas.microsoft.com/office/word/2024/wordml/sdtformatlock" xmlns:w16se="http://schemas.microsoft.com/office/word/2015/wordml/symex" xmlns:wpg="http://schemas.microsoft.com/office/word/2010/wordprocessingGroup" xmlns:wpi="http://schemas.microsoft.com/office/word/2010/wordprocessingInk" xmlns:wne="http://schemas.microsoft.com/office/word/2006/wordml" xmlns:wps="http://schemas.microsoft.com/office/word/2010/wordprocessingShape" mc:Ignorable="w14 w15 w16se w16cid w16 w16cex w16sdtdh w16sdtfl w16du wp14">
+<w:hdr xmlns:wpc="http://schemas.microsoft.com/office/word/2010/wordprocessingCanvas" xmlns:cx="http://schemas.microsoft.com/office/drawing/2014/chartex" xmlns:cx1="http://schemas.microsoft.com/office/drawing/2015/9/8/chartex" xmlns:cx2="http://schemas.microsoft.com/office/drawing/2015/10/21/chartex" xmlns:cx3="http://schemas.microsoft.com/office/drawing/2016/5/9/chartex" xmlns:cx4="http://schemas.microsoft.com/office/drawing/2016/5/10/chartex" xmlns:cx5="http://schemas.microsoft.com/office/drawing/2016/5/11/chartex" xmlns:cx6="http://schemas.microsoft.com/office/drawing/2016/5/12/chartex" xmlns:cx7="http://schemas.microsoft.com/office/drawing/2016/5/13/chartex" xmlns:cx8="http://schemas.microsoft.com/office/drawing/2016/5/14/chartex" xmlns:mc="http://schemas.openxmlformats.org/markup-compatibility/2006" xmlns:aink="http://schemas.microsoft.com/office/drawing/2016/ink" xmlns:am3d="http://schemas.microsoft.com/office/drawing/2017/model3d" xmlns:o="urn:schemas-microsoft-com:office:office" xmlns:oel="http://schemas.microsoft.com/office/2019/extlst" xmlns:r="http://schemas.openxmlformats.org/officeDocument/2006/relationships" xmlns:m="http://schemas.openxmlformats.org/officeDocument/2006/math" xmlns:v="urn:schemas-microsoft-com:vml" xmlns:wp14="http://schemas.microsoft.com/office/word/2010/wordprocessingDrawing" xmlns:wp="http://schemas.openxmlformats.org/drawingml/2006/wordprocessingDrawing" xmlns:w10="urn:schemas-microsoft-com:office:word" xmlns:w="http://schemas.openxmlformats.org/wordprocessingml/2006/main" xmlns:w14="http://schemas.microsoft.com/office/word/2010/wordml" xmlns:w15="http://schemas.microsoft.com/office/word/2012/wordml" xmlns:w16cex="http://schemas.microsoft.com/office/word/2018/wordml/cex" xmlns:w16cid="http://schemas.microsoft.com/office/word/2016/wordml/cid" xmlns:w16="http://schemas.microsoft.com/office/word/2018/wordml" xmlns:w16sdtdh="http://schemas.microsoft.com/office/word/2020/wordml/sdtdatahash" xmlns:w16se="http://schemas.microsoft.com/office/word/2015/wordml/symex" xmlns:wpg="http://schemas.microsoft.com/office/word/2010/wordprocessingGroup" xmlns:wpi="http://schemas.microsoft.com/office/word/2010/wordprocessingInk" xmlns:wne="http://schemas.microsoft.com/office/word/2006/wordml" xmlns:wps="http://schemas.microsoft.com/office/word/2010/wordprocessingShape" mc:Ignorable="w14 w15 w16se w16cid w16 w16cex w16sdtdh wp14">
+  <w:tbl>
+    <w:tblPr>
+      <w:tblW w:w="0" w:type="auto"/>
+      <w:tblLayout w:type="fixed"/>
+      <w:tblLook w:val="06A0" w:firstRow="1" w:lastRow="0" w:firstColumn="1" w:lastColumn="0" w:noHBand="1" w:noVBand="1"/>
+    </w:tblPr>
+    <w:tblGrid>
+      <w:gridCol w:w="2830"/>
+      <w:gridCol w:w="2830"/>
+      <w:gridCol w:w="2830"/>
+    </w:tblGrid>
+    <w:tr>
+      <w:trPr>
+        <w:trHeight w:val="300"/>
+      </w:trPr>
+      <w:tc>
+        <w:tcPr>
+          <w:tcW w:w="2830" w:type="dxa"/>
+        </w:tcPr>
+        <w:p>
+          <w:pPr>
+            <w:pStyle w:val="Kopfzeile"/>
+            <w:ind w:left="-115"/>
+            <w:jc w:val="left"/>
+          </w:pPr>
+        </w:p>
+      </w:tc>
+      <w:tc>
+        <w:tcPr>
+          <w:tcW w:w="2830" w:type="dxa"/>
+        </w:tcPr>
+        <w:p>
+          <w:pPr>
+            <w:pStyle w:val="Kopfzeile"/>
+            <w:jc w:val="center"/>
+          </w:pPr>
+        </w:p>
+      </w:tc>
+      <w:tc>
+        <w:tcPr>
+          <w:tcW w:w="2830" w:type="dxa"/>
+        </w:tcPr>
+        <w:p>
+          <w:pPr>
+            <w:pStyle w:val="Kopfzeile"/>
+            <w:ind w:right="-115"/>
+          </w:pPr>
+        </w:p>
+      </w:tc>
+    </w:tr>
+  </w:tbl>
   <w:p>
     <w:pPr>
-      <w:pStyle w:val="Header"/>
+      <w:pStyle w:val="Kopfzeile"/>
+    </w:pPr>
+  </w:p>
+</w:hdr>
+</file>
+
+<file path=word/header2.xml><?xml version="1.0" encoding="utf-8"?>
+<w:hdr xmlns:wpc="http://schemas.microsoft.com/office/word/2010/wordprocessingCanvas" xmlns:cx="http://schemas.microsoft.com/office/drawing/2014/chartex" xmlns:cx1="http://schemas.microsoft.com/office/drawing/2015/9/8/chartex" xmlns:cx2="http://schemas.microsoft.com/office/drawing/2015/10/21/chartex" xmlns:cx3="http://schemas.microsoft.com/office/drawing/2016/5/9/chartex" xmlns:cx4="http://schemas.microsoft.com/office/drawing/2016/5/10/chartex" xmlns:cx5="http://schemas.microsoft.com/office/drawing/2016/5/11/chartex" xmlns:cx6="http://schemas.microsoft.com/office/drawing/2016/5/12/chartex" xmlns:cx7="http://schemas.microsoft.com/office/drawing/2016/5/13/chartex" xmlns:cx8="http://schemas.microsoft.com/office/drawing/2016/5/14/chartex" xmlns:mc="http://schemas.openxmlformats.org/markup-compatibility/2006" xmlns:aink="http://schemas.microsoft.com/office/drawing/2016/ink" xmlns:am3d="http://schemas.microsoft.com/office/drawing/2017/model3d" xmlns:o="urn:schemas-microsoft-com:office:office" xmlns:oel="http://schemas.microsoft.com/office/2019/extlst" xmlns:r="http://schemas.openxmlformats.org/officeDocument/2006/relationships" xmlns:m="http://schemas.openxmlformats.org/officeDocument/2006/math" xmlns:v="urn:schemas-microsoft-com:vml" xmlns:wp14="http://schemas.microsoft.com/office/word/2010/wordprocessingDrawing" xmlns:wp="http://schemas.openxmlformats.org/drawingml/2006/wordprocessingDrawing" xmlns:w10="urn:schemas-microsoft-com:office:word" xmlns:w="http://schemas.openxmlformats.org/wordprocessingml/2006/main" xmlns:w14="http://schemas.microsoft.com/office/word/2010/wordml" xmlns:w15="http://schemas.microsoft.com/office/word/2012/wordml" xmlns:w16cex="http://schemas.microsoft.com/office/word/2018/wordml/cex" xmlns:w16cid="http://schemas.microsoft.com/office/word/2016/wordml/cid" xmlns:w16="http://schemas.microsoft.com/office/word/2018/wordml" xmlns:w16sdtdh="http://schemas.microsoft.com/office/word/2020/wordml/sdtdatahash" xmlns:w16se="http://schemas.microsoft.com/office/word/2015/wordml/symex" xmlns:wpg="http://schemas.microsoft.com/office/word/2010/wordprocessingGroup" xmlns:wpi="http://schemas.microsoft.com/office/word/2010/wordprocessingInk" xmlns:wne="http://schemas.microsoft.com/office/word/2006/wordml" xmlns:wps="http://schemas.microsoft.com/office/word/2010/wordprocessingShape" mc:Ignorable="w14 w15 w16se w16cid w16 w16cex w16sdtdh wp14">
+  <w:p>
+    <w:pPr>
+      <w:pStyle w:val="Kopfzeile"/>
       <w:rPr>
         <w:lang w:val="de-CH"/>
       </w:rPr>
@@ -4289,11 +4750,11 @@
 </w:hdr>
 </file>
 
-<file path=word/header2.xml><?xml version="1.0" encoding="utf-8"?>
-<w:hdr xmlns:wpc="http://schemas.microsoft.com/office/word/2010/wordprocessingCanvas" xmlns:cx="http://schemas.microsoft.com/office/drawing/2014/chartex" xmlns:cx1="http://schemas.microsoft.com/office/drawing/2015/9/8/chartex" xmlns:cx2="http://schemas.microsoft.com/office/drawing/2015/10/21/chartex" xmlns:cx3="http://schemas.microsoft.com/office/drawing/2016/5/9/chartex" xmlns:cx4="http://schemas.microsoft.com/office/drawing/2016/5/10/chartex" xmlns:cx5="http://schemas.microsoft.com/office/drawing/2016/5/11/chartex" xmlns:cx6="http://schemas.microsoft.com/office/drawing/2016/5/12/chartex" xmlns:cx7="http://schemas.microsoft.com/office/drawing/2016/5/13/chartex" xmlns:cx8="http://schemas.microsoft.com/office/drawing/2016/5/14/chartex" xmlns:mc="http://schemas.openxmlformats.org/markup-compatibility/2006" xmlns:aink="http://schemas.microsoft.com/office/drawing/2016/ink" xmlns:am3d="http://schemas.microsoft.com/office/drawing/2017/model3d" xmlns:o="urn:schemas-microsoft-com:office:office" xmlns:oel="http://schemas.microsoft.com/office/2019/extlst" xmlns:r="http://schemas.openxmlformats.org/officeDocument/2006/relationships" xmlns:m="http://schemas.openxmlformats.org/officeDocument/2006/math" xmlns:v="urn:schemas-microsoft-com:vml" xmlns:wp14="http://schemas.microsoft.com/office/word/2010/wordprocessingDrawing" xmlns:wp="http://schemas.openxmlformats.org/drawingml/2006/wordprocessingDrawing" xmlns:w10="urn:schemas-microsoft-com:office:word" xmlns:w="http://schemas.openxmlformats.org/wordprocessingml/2006/main" xmlns:w14="http://schemas.microsoft.com/office/word/2010/wordml" xmlns:w15="http://schemas.microsoft.com/office/word/2012/wordml" xmlns:w16cex="http://schemas.microsoft.com/office/word/2018/wordml/cex" xmlns:w16cid="http://schemas.microsoft.com/office/word/2016/wordml/cid" xmlns:w16="http://schemas.microsoft.com/office/word/2018/wordml" xmlns:w16du="http://schemas.microsoft.com/office/word/2023/wordml/word16du" xmlns:w16sdtdh="http://schemas.microsoft.com/office/word/2020/wordml/sdtdatahash" xmlns:w16sdtfl="http://schemas.microsoft.com/office/word/2024/wordml/sdtformatlock" xmlns:w16se="http://schemas.microsoft.com/office/word/2015/wordml/symex" xmlns:wpg="http://schemas.microsoft.com/office/word/2010/wordprocessingGroup" xmlns:wpi="http://schemas.microsoft.com/office/word/2010/wordprocessingInk" xmlns:wne="http://schemas.microsoft.com/office/word/2006/wordml" xmlns:wps="http://schemas.microsoft.com/office/word/2010/wordprocessingShape" mc:Ignorable="w14 w15 w16se w16cid w16 w16cex w16sdtdh w16sdtfl w16du wp14">
+<file path=word/header3.xml><?xml version="1.0" encoding="utf-8"?>
+<w:hdr xmlns:wpc="http://schemas.microsoft.com/office/word/2010/wordprocessingCanvas" xmlns:cx="http://schemas.microsoft.com/office/drawing/2014/chartex" xmlns:cx1="http://schemas.microsoft.com/office/drawing/2015/9/8/chartex" xmlns:cx2="http://schemas.microsoft.com/office/drawing/2015/10/21/chartex" xmlns:cx3="http://schemas.microsoft.com/office/drawing/2016/5/9/chartex" xmlns:cx4="http://schemas.microsoft.com/office/drawing/2016/5/10/chartex" xmlns:cx5="http://schemas.microsoft.com/office/drawing/2016/5/11/chartex" xmlns:cx6="http://schemas.microsoft.com/office/drawing/2016/5/12/chartex" xmlns:cx7="http://schemas.microsoft.com/office/drawing/2016/5/13/chartex" xmlns:cx8="http://schemas.microsoft.com/office/drawing/2016/5/14/chartex" xmlns:mc="http://schemas.openxmlformats.org/markup-compatibility/2006" xmlns:aink="http://schemas.microsoft.com/office/drawing/2016/ink" xmlns:am3d="http://schemas.microsoft.com/office/drawing/2017/model3d" xmlns:o="urn:schemas-microsoft-com:office:office" xmlns:oel="http://schemas.microsoft.com/office/2019/extlst" xmlns:r="http://schemas.openxmlformats.org/officeDocument/2006/relationships" xmlns:m="http://schemas.openxmlformats.org/officeDocument/2006/math" xmlns:v="urn:schemas-microsoft-com:vml" xmlns:wp14="http://schemas.microsoft.com/office/word/2010/wordprocessingDrawing" xmlns:wp="http://schemas.openxmlformats.org/drawingml/2006/wordprocessingDrawing" xmlns:w10="urn:schemas-microsoft-com:office:word" xmlns:w="http://schemas.openxmlformats.org/wordprocessingml/2006/main" xmlns:w14="http://schemas.microsoft.com/office/word/2010/wordml" xmlns:w15="http://schemas.microsoft.com/office/word/2012/wordml" xmlns:w16cex="http://schemas.microsoft.com/office/word/2018/wordml/cex" xmlns:w16cid="http://schemas.microsoft.com/office/word/2016/wordml/cid" xmlns:w16="http://schemas.microsoft.com/office/word/2018/wordml" xmlns:w16sdtdh="http://schemas.microsoft.com/office/word/2020/wordml/sdtdatahash" xmlns:w16se="http://schemas.microsoft.com/office/word/2015/wordml/symex" xmlns:wpg="http://schemas.microsoft.com/office/word/2010/wordprocessingGroup" xmlns:wpi="http://schemas.microsoft.com/office/word/2010/wordprocessingInk" xmlns:wne="http://schemas.microsoft.com/office/word/2006/wordml" xmlns:wps="http://schemas.microsoft.com/office/word/2010/wordprocessingShape" mc:Ignorable="w14 w15 w16se w16cid w16 w16cex w16sdtdh wp14">
   <w:p>
     <w:pPr>
-      <w:pStyle w:val="Header"/>
+      <w:pStyle w:val="Kopfzeile"/>
     </w:pPr>
     <w:r>
       <w:t>Kurztitel der Arbeit</w:t>
@@ -4303,7 +4764,7 @@
 </file>
 
 <file path=word/numbering.xml><?xml version="1.0" encoding="utf-8"?>
-<w:numbering xmlns:wpc="http://schemas.microsoft.com/office/word/2010/wordprocessingCanvas" xmlns:cx="http://schemas.microsoft.com/office/drawing/2014/chartex" xmlns:cx1="http://schemas.microsoft.com/office/drawing/2015/9/8/chartex" xmlns:cx2="http://schemas.microsoft.com/office/drawing/2015/10/21/chartex" xmlns:cx3="http://schemas.microsoft.com/office/drawing/2016/5/9/chartex" xmlns:cx4="http://schemas.microsoft.com/office/drawing/2016/5/10/chartex" xmlns:cx5="http://schemas.microsoft.com/office/drawing/2016/5/11/chartex" xmlns:cx6="http://schemas.microsoft.com/office/drawing/2016/5/12/chartex" xmlns:cx7="http://schemas.microsoft.com/office/drawing/2016/5/13/chartex" xmlns:cx8="http://schemas.microsoft.com/office/drawing/2016/5/14/chartex" xmlns:mc="http://schemas.openxmlformats.org/markup-compatibility/2006" xmlns:aink="http://schemas.microsoft.com/office/drawing/2016/ink" xmlns:am3d="http://schemas.microsoft.com/office/drawing/2017/model3d" xmlns:o="urn:schemas-microsoft-com:office:office" xmlns:oel="http://schemas.microsoft.com/office/2019/extlst" xmlns:r="http://schemas.openxmlformats.org/officeDocument/2006/relationships" xmlns:m="http://schemas.openxmlformats.org/officeDocument/2006/math" xmlns:v="urn:schemas-microsoft-com:vml" xmlns:wp14="http://schemas.microsoft.com/office/word/2010/wordprocessingDrawing" xmlns:wp="http://schemas.openxmlformats.org/drawingml/2006/wordprocessingDrawing" xmlns:w10="urn:schemas-microsoft-com:office:word" xmlns:w="http://schemas.openxmlformats.org/wordprocessingml/2006/main" xmlns:w14="http://schemas.microsoft.com/office/word/2010/wordml" xmlns:w15="http://schemas.microsoft.com/office/word/2012/wordml" xmlns:w16cex="http://schemas.microsoft.com/office/word/2018/wordml/cex" xmlns:w16cid="http://schemas.microsoft.com/office/word/2016/wordml/cid" xmlns:w16="http://schemas.microsoft.com/office/word/2018/wordml" xmlns:w16du="http://schemas.microsoft.com/office/word/2023/wordml/word16du" xmlns:w16sdtdh="http://schemas.microsoft.com/office/word/2020/wordml/sdtdatahash" xmlns:w16sdtfl="http://schemas.microsoft.com/office/word/2024/wordml/sdtformatlock" xmlns:w16se="http://schemas.microsoft.com/office/word/2015/wordml/symex" xmlns:wpg="http://schemas.microsoft.com/office/word/2010/wordprocessingGroup" xmlns:wpi="http://schemas.microsoft.com/office/word/2010/wordprocessingInk" xmlns:wne="http://schemas.microsoft.com/office/word/2006/wordml" xmlns:wps="http://schemas.microsoft.com/office/word/2010/wordprocessingShape" mc:Ignorable="w14 w15 w16se w16cid w16 w16cex w16sdtdh w16sdtfl w16du wp14">
+<w:numbering xmlns:wpc="http://schemas.microsoft.com/office/word/2010/wordprocessingCanvas" xmlns:cx="http://schemas.microsoft.com/office/drawing/2014/chartex" xmlns:cx1="http://schemas.microsoft.com/office/drawing/2015/9/8/chartex" xmlns:cx2="http://schemas.microsoft.com/office/drawing/2015/10/21/chartex" xmlns:cx3="http://schemas.microsoft.com/office/drawing/2016/5/9/chartex" xmlns:cx4="http://schemas.microsoft.com/office/drawing/2016/5/10/chartex" xmlns:cx5="http://schemas.microsoft.com/office/drawing/2016/5/11/chartex" xmlns:cx6="http://schemas.microsoft.com/office/drawing/2016/5/12/chartex" xmlns:cx7="http://schemas.microsoft.com/office/drawing/2016/5/13/chartex" xmlns:cx8="http://schemas.microsoft.com/office/drawing/2016/5/14/chartex" xmlns:mc="http://schemas.openxmlformats.org/markup-compatibility/2006" xmlns:aink="http://schemas.microsoft.com/office/drawing/2016/ink" xmlns:am3d="http://schemas.microsoft.com/office/drawing/2017/model3d" xmlns:o="urn:schemas-microsoft-com:office:office" xmlns:oel="http://schemas.microsoft.com/office/2019/extlst" xmlns:r="http://schemas.openxmlformats.org/officeDocument/2006/relationships" xmlns:m="http://schemas.openxmlformats.org/officeDocument/2006/math" xmlns:v="urn:schemas-microsoft-com:vml" xmlns:wp14="http://schemas.microsoft.com/office/word/2010/wordprocessingDrawing" xmlns:wp="http://schemas.openxmlformats.org/drawingml/2006/wordprocessingDrawing" xmlns:w10="urn:schemas-microsoft-com:office:word" xmlns:w="http://schemas.openxmlformats.org/wordprocessingml/2006/main" xmlns:w14="http://schemas.microsoft.com/office/word/2010/wordml" xmlns:w15="http://schemas.microsoft.com/office/word/2012/wordml" xmlns:w16cex="http://schemas.microsoft.com/office/word/2018/wordml/cex" xmlns:w16cid="http://schemas.microsoft.com/office/word/2016/wordml/cid" xmlns:w16="http://schemas.microsoft.com/office/word/2018/wordml" xmlns:w16sdtdh="http://schemas.microsoft.com/office/word/2020/wordml/sdtdatahash" xmlns:w16se="http://schemas.microsoft.com/office/word/2015/wordml/symex" xmlns:wpg="http://schemas.microsoft.com/office/word/2010/wordprocessingGroup" xmlns:wpi="http://schemas.microsoft.com/office/word/2010/wordprocessingInk" xmlns:wne="http://schemas.microsoft.com/office/word/2006/wordml" xmlns:wps="http://schemas.microsoft.com/office/word/2010/wordprocessingShape" mc:Ignorable="w14 w15 w16se w16cid w16 w16cex w16sdtdh wp14">
   <w:abstractNum w:abstractNumId="0" w15:restartNumberingAfterBreak="0">
     <w:nsid w:val="FFFFFF7C"/>
     <w:multiLevelType w:val="singleLevel"/>
@@ -4459,7 +4920,7 @@
     <w:lvl w:ilvl="0">
       <w:start w:val="1"/>
       <w:numFmt w:val="decimal"/>
-      <w:pStyle w:val="ListNumber"/>
+      <w:pStyle w:val="Listennummer"/>
       <w:lvlText w:val="%1."/>
       <w:lvlJc w:val="left"/>
       <w:pPr>
@@ -4477,7 +4938,7 @@
     <w:lvl w:ilvl="0">
       <w:start w:val="1"/>
       <w:numFmt w:val="bullet"/>
-      <w:pStyle w:val="ListBullet"/>
+      <w:pStyle w:val="Aufzhlungszeichen"/>
       <w:lvlText w:val=""/>
       <w:lvlJc w:val="left"/>
       <w:pPr>
@@ -6233,7 +6694,7 @@
     <w:lvl w:ilvl="0">
       <w:start w:val="1"/>
       <w:numFmt w:val="decimal"/>
-      <w:pStyle w:val="Heading1"/>
+      <w:pStyle w:val="berschrift1"/>
       <w:lvlText w:val="%1"/>
       <w:lvlJc w:val="left"/>
       <w:pPr>
@@ -6246,7 +6707,7 @@
     <w:lvl w:ilvl="1">
       <w:start w:val="1"/>
       <w:numFmt w:val="decimal"/>
-      <w:pStyle w:val="Heading2"/>
+      <w:pStyle w:val="berschrift2"/>
       <w:lvlText w:val="%1.%2"/>
       <w:lvlJc w:val="left"/>
       <w:pPr>
@@ -6259,7 +6720,7 @@
     <w:lvl w:ilvl="2">
       <w:start w:val="1"/>
       <w:numFmt w:val="decimal"/>
-      <w:pStyle w:val="Heading3"/>
+      <w:pStyle w:val="berschrift3"/>
       <w:lvlText w:val="%1.%2.%3"/>
       <w:lvlJc w:val="left"/>
       <w:pPr>
@@ -6272,7 +6733,7 @@
     <w:lvl w:ilvl="3">
       <w:start w:val="1"/>
       <w:numFmt w:val="decimal"/>
-      <w:pStyle w:val="Heading4"/>
+      <w:pStyle w:val="berschrift4"/>
       <w:lvlText w:val="%1.%2.%3.%4"/>
       <w:lvlJc w:val="left"/>
       <w:pPr>
@@ -6285,7 +6746,7 @@
     <w:lvl w:ilvl="4">
       <w:start w:val="1"/>
       <w:numFmt w:val="decimal"/>
-      <w:pStyle w:val="Heading5"/>
+      <w:pStyle w:val="berschrift5"/>
       <w:lvlText w:val="%1.%2.%3.%4.%5"/>
       <w:lvlJc w:val="left"/>
       <w:pPr>
@@ -6298,7 +6759,7 @@
     <w:lvl w:ilvl="5">
       <w:start w:val="1"/>
       <w:numFmt w:val="decimal"/>
-      <w:pStyle w:val="Heading6"/>
+      <w:pStyle w:val="berschrift6"/>
       <w:lvlText w:val="%1.%2.%3.%4.%5.%6"/>
       <w:lvlJc w:val="left"/>
       <w:pPr>
@@ -6311,7 +6772,7 @@
     <w:lvl w:ilvl="6">
       <w:start w:val="1"/>
       <w:numFmt w:val="decimal"/>
-      <w:pStyle w:val="Heading7"/>
+      <w:pStyle w:val="berschrift7"/>
       <w:lvlText w:val="%1.%2.%3.%4.%5.%6.%7"/>
       <w:lvlJc w:val="left"/>
       <w:pPr>
@@ -6324,7 +6785,7 @@
     <w:lvl w:ilvl="7">
       <w:start w:val="1"/>
       <w:numFmt w:val="decimal"/>
-      <w:pStyle w:val="Heading8"/>
+      <w:pStyle w:val="berschrift8"/>
       <w:lvlText w:val="%1.%2.%3.%4.%5.%6.%7.%8"/>
       <w:lvlJc w:val="left"/>
       <w:pPr>
@@ -6337,7 +6798,7 @@
     <w:lvl w:ilvl="8">
       <w:start w:val="1"/>
       <w:numFmt w:val="decimal"/>
-      <w:pStyle w:val="Heading9"/>
+      <w:pStyle w:val="berschrift9"/>
       <w:lvlText w:val="%1.%2.%3.%4.%5.%6.%7.%8.%9"/>
       <w:lvlJc w:val="left"/>
       <w:pPr>
@@ -6935,7 +7396,7 @@
 </file>
 
 <file path=word/styles.xml><?xml version="1.0" encoding="utf-8"?>
-<w:styles xmlns:mc="http://schemas.openxmlformats.org/markup-compatibility/2006" xmlns:r="http://schemas.openxmlformats.org/officeDocument/2006/relationships" xmlns:w="http://schemas.openxmlformats.org/wordprocessingml/2006/main" xmlns:w14="http://schemas.microsoft.com/office/word/2010/wordml" xmlns:w15="http://schemas.microsoft.com/office/word/2012/wordml" xmlns:w16cex="http://schemas.microsoft.com/office/word/2018/wordml/cex" xmlns:w16cid="http://schemas.microsoft.com/office/word/2016/wordml/cid" xmlns:w16="http://schemas.microsoft.com/office/word/2018/wordml" xmlns:w16du="http://schemas.microsoft.com/office/word/2023/wordml/word16du" xmlns:w16sdtdh="http://schemas.microsoft.com/office/word/2020/wordml/sdtdatahash" xmlns:w16sdtfl="http://schemas.microsoft.com/office/word/2024/wordml/sdtformatlock" xmlns:w16se="http://schemas.microsoft.com/office/word/2015/wordml/symex" mc:Ignorable="w14 w15 w16se w16cid w16 w16cex w16sdtdh w16sdtfl w16du">
+<w:styles xmlns:mc="http://schemas.openxmlformats.org/markup-compatibility/2006" xmlns:r="http://schemas.openxmlformats.org/officeDocument/2006/relationships" xmlns:w="http://schemas.openxmlformats.org/wordprocessingml/2006/main" xmlns:w14="http://schemas.microsoft.com/office/word/2010/wordml" xmlns:w15="http://schemas.microsoft.com/office/word/2012/wordml" xmlns:w16cex="http://schemas.microsoft.com/office/word/2018/wordml/cex" xmlns:w16cid="http://schemas.microsoft.com/office/word/2016/wordml/cid" xmlns:w16="http://schemas.microsoft.com/office/word/2018/wordml" xmlns:w16sdtdh="http://schemas.microsoft.com/office/word/2020/wordml/sdtdatahash" xmlns:w16se="http://schemas.microsoft.com/office/word/2015/wordml/symex" mc:Ignorable="w14 w15 w16se w16cid w16 w16cex w16sdtdh">
   <w:docDefaults>
     <w:rPrDefault>
       <w:rPr>
@@ -7325,7 +7786,7 @@
     <w:lsdException w:name="Unresolved Mention" w:semiHidden="1" w:unhideWhenUsed="1"/>
     <w:lsdException w:name="Smart Link" w:semiHidden="1" w:unhideWhenUsed="1"/>
   </w:latentStyles>
-  <w:style w:type="paragraph" w:default="1" w:styleId="Normal">
+  <w:style w:type="paragraph" w:default="1" w:styleId="Standard">
     <w:name w:val="Normal"/>
     <w:qFormat/>
     <w:rsid w:val="000357FF"/>
@@ -7337,11 +7798,11 @@
       <w:lang w:val="de-LI" w:eastAsia="de-DE"/>
     </w:rPr>
   </w:style>
-  <w:style w:type="paragraph" w:styleId="Heading1">
+  <w:style w:type="paragraph" w:styleId="berschrift1">
     <w:name w:val="heading 1"/>
-    <w:basedOn w:val="Normal"/>
-    <w:next w:val="BodyText"/>
-    <w:link w:val="Heading1Char"/>
+    <w:basedOn w:val="Standard"/>
+    <w:next w:val="Textkrper"/>
+    <w:link w:val="berschrift1Zchn"/>
     <w:qFormat/>
     <w:rsid w:val="00861164"/>
     <w:pPr>
@@ -7368,10 +7829,10 @@
       <w:lang w:val="de-CH"/>
     </w:rPr>
   </w:style>
-  <w:style w:type="paragraph" w:styleId="Heading2">
+  <w:style w:type="paragraph" w:styleId="berschrift2">
     <w:name w:val="heading 2"/>
-    <w:basedOn w:val="BodyText"/>
-    <w:next w:val="BodyText"/>
+    <w:basedOn w:val="Textkrper"/>
+    <w:next w:val="Textkrper"/>
     <w:qFormat/>
     <w:rsid w:val="00861164"/>
     <w:pPr>
@@ -7396,10 +7857,10 @@
       <w:szCs w:val="28"/>
     </w:rPr>
   </w:style>
-  <w:style w:type="paragraph" w:styleId="Heading3">
+  <w:style w:type="paragraph" w:styleId="berschrift3">
     <w:name w:val="heading 3"/>
-    <w:basedOn w:val="BodyText"/>
-    <w:next w:val="BodyText"/>
+    <w:basedOn w:val="Textkrper"/>
+    <w:next w:val="Textkrper"/>
     <w:qFormat/>
     <w:rsid w:val="00861164"/>
     <w:pPr>
@@ -7422,10 +7883,10 @@
       <w:szCs w:val="28"/>
     </w:rPr>
   </w:style>
-  <w:style w:type="paragraph" w:styleId="Heading4">
+  <w:style w:type="paragraph" w:styleId="berschrift4">
     <w:name w:val="heading 4"/>
-    <w:basedOn w:val="Normal"/>
-    <w:next w:val="Normal"/>
+    <w:basedOn w:val="Standard"/>
+    <w:next w:val="Standard"/>
     <w:pPr>
       <w:keepNext/>
       <w:numPr>
@@ -7442,10 +7903,10 @@
       <w:szCs w:val="28"/>
     </w:rPr>
   </w:style>
-  <w:style w:type="paragraph" w:styleId="Heading5">
+  <w:style w:type="paragraph" w:styleId="berschrift5">
     <w:name w:val="heading 5"/>
-    <w:basedOn w:val="Normal"/>
-    <w:next w:val="Normal"/>
+    <w:basedOn w:val="Standard"/>
+    <w:next w:val="Standard"/>
     <w:pPr>
       <w:numPr>
         <w:ilvl w:val="4"/>
@@ -7463,10 +7924,10 @@
       <w:szCs w:val="26"/>
     </w:rPr>
   </w:style>
-  <w:style w:type="paragraph" w:styleId="Heading6">
+  <w:style w:type="paragraph" w:styleId="berschrift6">
     <w:name w:val="heading 6"/>
-    <w:basedOn w:val="Normal"/>
-    <w:next w:val="Normal"/>
+    <w:basedOn w:val="Standard"/>
+    <w:next w:val="Standard"/>
     <w:pPr>
       <w:numPr>
         <w:ilvl w:val="5"/>
@@ -7481,10 +7942,10 @@
       <w:szCs w:val="22"/>
     </w:rPr>
   </w:style>
-  <w:style w:type="paragraph" w:styleId="Heading7">
+  <w:style w:type="paragraph" w:styleId="berschrift7">
     <w:name w:val="heading 7"/>
-    <w:basedOn w:val="Normal"/>
-    <w:next w:val="Normal"/>
+    <w:basedOn w:val="Standard"/>
+    <w:next w:val="Standard"/>
     <w:pPr>
       <w:numPr>
         <w:ilvl w:val="6"/>
@@ -7494,10 +7955,10 @@
       <w:outlineLvl w:val="6"/>
     </w:pPr>
   </w:style>
-  <w:style w:type="paragraph" w:styleId="Heading8">
+  <w:style w:type="paragraph" w:styleId="berschrift8">
     <w:name w:val="heading 8"/>
-    <w:basedOn w:val="Normal"/>
-    <w:next w:val="Normal"/>
+    <w:basedOn w:val="Standard"/>
+    <w:next w:val="Standard"/>
     <w:pPr>
       <w:numPr>
         <w:ilvl w:val="7"/>
@@ -7511,10 +7972,10 @@
       <w:iCs/>
     </w:rPr>
   </w:style>
-  <w:style w:type="paragraph" w:styleId="Heading9">
+  <w:style w:type="paragraph" w:styleId="berschrift9">
     <w:name w:val="heading 9"/>
-    <w:basedOn w:val="Normal"/>
-    <w:next w:val="Normal"/>
+    <w:basedOn w:val="Standard"/>
+    <w:next w:val="Standard"/>
     <w:pPr>
       <w:numPr>
         <w:ilvl w:val="8"/>
@@ -7528,13 +7989,13 @@
       <w:szCs w:val="22"/>
     </w:rPr>
   </w:style>
-  <w:style w:type="character" w:default="1" w:styleId="DefaultParagraphFont">
+  <w:style w:type="character" w:default="1" w:styleId="Absatz-Standardschriftart">
     <w:name w:val="Default Paragraph Font"/>
     <w:uiPriority w:val="1"/>
     <w:semiHidden/>
     <w:unhideWhenUsed/>
   </w:style>
-  <w:style w:type="table" w:default="1" w:styleId="TableNormal">
+  <w:style w:type="table" w:default="1" w:styleId="NormaleTabelle">
     <w:name w:val="Normal Table"/>
     <w:uiPriority w:val="99"/>
     <w:semiHidden/>
@@ -7549,16 +8010,16 @@
       </w:tblCellMar>
     </w:tblPr>
   </w:style>
-  <w:style w:type="numbering" w:default="1" w:styleId="NoList">
+  <w:style w:type="numbering" w:default="1" w:styleId="KeineListe">
     <w:name w:val="No List"/>
     <w:uiPriority w:val="99"/>
     <w:semiHidden/>
     <w:unhideWhenUsed/>
   </w:style>
-  <w:style w:type="character" w:customStyle="1" w:styleId="Heading1Char">
-    <w:name w:val="Heading 1 Char"/>
-    <w:basedOn w:val="DefaultParagraphFont"/>
-    <w:link w:val="Heading1"/>
+  <w:style w:type="character" w:customStyle="1" w:styleId="berschrift1Zchn">
+    <w:name w:val="Überschrift 1 Zchn"/>
+    <w:basedOn w:val="Absatz-Standardschriftart"/>
+    <w:link w:val="berschrift1"/>
     <w:rsid w:val="00861164"/>
     <w:rPr>
       <w:rFonts w:cs="Arial"/>
@@ -7571,11 +8032,11 @@
       <w:lang w:eastAsia="de-DE"/>
     </w:rPr>
   </w:style>
-  <w:style w:type="paragraph" w:styleId="Quote">
+  <w:style w:type="paragraph" w:styleId="Zitat">
     <w:name w:val="Quote"/>
-    <w:basedOn w:val="Normal"/>
-    <w:next w:val="Normal"/>
-    <w:link w:val="QuoteChar"/>
+    <w:basedOn w:val="Standard"/>
+    <w:next w:val="Standard"/>
+    <w:link w:val="ZitatZchn"/>
     <w:uiPriority w:val="29"/>
     <w:qFormat/>
     <w:rsid w:val="00D93186"/>
@@ -7589,10 +8050,10 @@
       <w:color w:val="404040" w:themeColor="text1" w:themeTint="BF"/>
     </w:rPr>
   </w:style>
-  <w:style w:type="character" w:customStyle="1" w:styleId="QuoteChar">
-    <w:name w:val="Quote Char"/>
-    <w:basedOn w:val="DefaultParagraphFont"/>
-    <w:link w:val="Quote"/>
+  <w:style w:type="character" w:customStyle="1" w:styleId="ZitatZchn">
+    <w:name w:val="Zitat Zchn"/>
+    <w:basedOn w:val="Absatz-Standardschriftart"/>
+    <w:link w:val="Zitat"/>
     <w:uiPriority w:val="29"/>
     <w:rsid w:val="00D93186"/>
     <w:rPr>
@@ -7604,7 +8065,7 @@
   </w:style>
   <w:style w:type="paragraph" w:customStyle="1" w:styleId="TBArtderArbeit">
     <w:name w:val="TB_Art_der_Arbeit"/>
-    <w:basedOn w:val="Normal"/>
+    <w:basedOn w:val="Standard"/>
     <w:rsid w:val="0059372C"/>
     <w:rPr>
       <w:b/>
@@ -7612,9 +8073,9 @@
       <w:lang w:val="de-CH"/>
     </w:rPr>
   </w:style>
-  <w:style w:type="paragraph" w:styleId="Header">
+  <w:style w:type="paragraph" w:styleId="Kopfzeile">
     <w:name w:val="header"/>
-    <w:basedOn w:val="Normal"/>
+    <w:basedOn w:val="Standard"/>
     <w:qFormat/>
     <w:rsid w:val="001D21D0"/>
     <w:pPr>
@@ -7629,9 +8090,9 @@
       <w:sz w:val="18"/>
     </w:rPr>
   </w:style>
-  <w:style w:type="paragraph" w:styleId="Footer">
+  <w:style w:type="paragraph" w:styleId="Fuzeile">
     <w:name w:val="footer"/>
-    <w:basedOn w:val="Normal"/>
+    <w:basedOn w:val="Standard"/>
     <w:qFormat/>
     <w:pPr>
       <w:tabs>
@@ -7644,10 +8105,10 @@
       <w:sz w:val="16"/>
     </w:rPr>
   </w:style>
-  <w:style w:type="paragraph" w:styleId="BodyText">
+  <w:style w:type="paragraph" w:styleId="Textkrper">
     <w:name w:val="Body Text"/>
-    <w:basedOn w:val="Normal"/>
-    <w:link w:val="BodyTextChar"/>
+    <w:basedOn w:val="Standard"/>
+    <w:link w:val="TextkrperZchn"/>
     <w:rsid w:val="00336A23"/>
     <w:pPr>
       <w:jc w:val="both"/>
@@ -7656,9 +8117,9 @@
       <w:szCs w:val="22"/>
     </w:rPr>
   </w:style>
-  <w:style w:type="character" w:styleId="PageNumber">
+  <w:style w:type="character" w:styleId="Seitenzahl">
     <w:name w:val="page number"/>
-    <w:basedOn w:val="DefaultParagraphFont"/>
+    <w:basedOn w:val="Absatz-Standardschriftart"/>
     <w:rPr>
       <w:rFonts w:ascii="Arial" w:hAnsi="Arial"/>
       <w:sz w:val="16"/>
@@ -7666,17 +8127,17 @@
   </w:style>
   <w:style w:type="paragraph" w:customStyle="1" w:styleId="Abbildung">
     <w:name w:val="Abbildung"/>
-    <w:basedOn w:val="Normal"/>
+    <w:basedOn w:val="Standard"/>
     <w:rsid w:val="0059372C"/>
     <w:rPr>
       <w:sz w:val="18"/>
       <w:lang w:val="de-CH"/>
     </w:rPr>
   </w:style>
-  <w:style w:type="paragraph" w:styleId="TOC2">
+  <w:style w:type="paragraph" w:styleId="Verzeichnis2">
     <w:name w:val="toc 2"/>
-    <w:basedOn w:val="Normal"/>
-    <w:next w:val="Normal"/>
+    <w:basedOn w:val="Standard"/>
+    <w:next w:val="Standard"/>
     <w:uiPriority w:val="39"/>
     <w:pPr>
       <w:tabs>
@@ -7686,10 +8147,10 @@
       <w:ind w:left="720"/>
     </w:pPr>
   </w:style>
-  <w:style w:type="paragraph" w:styleId="TOC1">
+  <w:style w:type="paragraph" w:styleId="Verzeichnis1">
     <w:name w:val="toc 1"/>
-    <w:basedOn w:val="Normal"/>
-    <w:next w:val="Normal"/>
+    <w:basedOn w:val="Standard"/>
+    <w:next w:val="Standard"/>
     <w:uiPriority w:val="39"/>
     <w:pPr>
       <w:tabs>
@@ -7701,10 +8162,10 @@
       <w:b/>
     </w:rPr>
   </w:style>
-  <w:style w:type="paragraph" w:styleId="TOC3">
+  <w:style w:type="paragraph" w:styleId="Verzeichnis3">
     <w:name w:val="toc 3"/>
-    <w:basedOn w:val="Normal"/>
-    <w:next w:val="Normal"/>
+    <w:basedOn w:val="Standard"/>
+    <w:next w:val="Standard"/>
     <w:uiPriority w:val="39"/>
     <w:pPr>
       <w:tabs>
@@ -7717,7 +8178,7 @@
   </w:style>
   <w:style w:type="character" w:styleId="Hyperlink">
     <w:name w:val="Hyperlink"/>
-    <w:basedOn w:val="DefaultParagraphFont"/>
+    <w:basedOn w:val="Absatz-Standardschriftart"/>
     <w:uiPriority w:val="99"/>
     <w:rPr>
       <w:rFonts w:ascii="Arial" w:hAnsi="Arial"/>
@@ -7725,10 +8186,10 @@
       <w:u w:val="single"/>
     </w:rPr>
   </w:style>
-  <w:style w:type="paragraph" w:styleId="TableofFigures">
+  <w:style w:type="paragraph" w:styleId="Abbildungsverzeichnis">
     <w:name w:val="table of figures"/>
-    <w:basedOn w:val="BodyText"/>
-    <w:next w:val="Normal"/>
+    <w:basedOn w:val="Textkrper"/>
+    <w:next w:val="Standard"/>
     <w:uiPriority w:val="99"/>
     <w:pPr>
       <w:ind w:left="480" w:hanging="480"/>
@@ -7736,7 +8197,7 @@
   </w:style>
   <w:style w:type="paragraph" w:customStyle="1" w:styleId="Tabelle">
     <w:name w:val="Tabelle"/>
-    <w:basedOn w:val="Normal"/>
+    <w:basedOn w:val="Standard"/>
     <w:rsid w:val="0059372C"/>
     <w:rPr>
       <w:sz w:val="18"/>
@@ -7745,7 +8206,7 @@
   </w:style>
   <w:style w:type="paragraph" w:customStyle="1" w:styleId="Inhaltsverzeichnis">
     <w:name w:val="Inhaltsverzeichnis"/>
-    <w:basedOn w:val="BodyText"/>
+    <w:basedOn w:val="Textkrper"/>
     <w:rPr>
       <w:b/>
       <w:bCs/>
@@ -7754,9 +8215,9 @@
       <w:szCs w:val="28"/>
     </w:rPr>
   </w:style>
-  <w:style w:type="paragraph" w:styleId="Bibliography">
+  <w:style w:type="paragraph" w:styleId="Literaturverzeichnis">
     <w:name w:val="Bibliography"/>
-    <w:basedOn w:val="BodyText"/>
+    <w:basedOn w:val="Textkrper"/>
     <w:qFormat/>
     <w:rsid w:val="00520D17"/>
     <w:pPr>
@@ -7766,9 +8227,9 @@
       <w:szCs w:val="20"/>
     </w:rPr>
   </w:style>
-  <w:style w:type="table" w:styleId="TableGrid">
+  <w:style w:type="table" w:styleId="Tabellenraster">
     <w:name w:val="Table Grid"/>
-    <w:basedOn w:val="TableNormal"/>
+    <w:basedOn w:val="NormaleTabelle"/>
     <w:pPr>
       <w:spacing w:line="360" w:lineRule="auto"/>
     </w:pPr>
@@ -7785,7 +8246,7 @@
   </w:style>
   <w:style w:type="paragraph" w:customStyle="1" w:styleId="TabelleInhalt">
     <w:name w:val="Tabelle_Inhalt"/>
-    <w:basedOn w:val="BodyText"/>
+    <w:basedOn w:val="Textkrper"/>
     <w:qFormat/>
     <w:rsid w:val="00B374BB"/>
     <w:pPr>
@@ -7795,10 +8256,10 @@
       <w:sz w:val="20"/>
     </w:rPr>
   </w:style>
-  <w:style w:type="paragraph" w:styleId="BalloonText">
+  <w:style w:type="paragraph" w:styleId="Sprechblasentext">
     <w:name w:val="Balloon Text"/>
-    <w:basedOn w:val="Normal"/>
-    <w:link w:val="BalloonTextChar"/>
+    <w:basedOn w:val="Standard"/>
+    <w:link w:val="SprechblasentextZchn"/>
     <w:uiPriority w:val="99"/>
     <w:semiHidden/>
     <w:unhideWhenUsed/>
@@ -7811,10 +8272,10 @@
       <w:szCs w:val="16"/>
     </w:rPr>
   </w:style>
-  <w:style w:type="character" w:customStyle="1" w:styleId="BalloonTextChar">
-    <w:name w:val="Balloon Text Char"/>
-    <w:basedOn w:val="DefaultParagraphFont"/>
-    <w:link w:val="BalloonText"/>
+  <w:style w:type="character" w:customStyle="1" w:styleId="SprechblasentextZchn">
+    <w:name w:val="Sprechblasentext Zchn"/>
+    <w:basedOn w:val="Absatz-Standardschriftart"/>
+    <w:link w:val="Sprechblasentext"/>
     <w:uiPriority w:val="99"/>
     <w:semiHidden/>
     <w:rPr>
@@ -7824,9 +8285,9 @@
       <w:lang w:val="de-DE" w:eastAsia="de-DE"/>
     </w:rPr>
   </w:style>
-  <w:style w:type="paragraph" w:styleId="List">
+  <w:style w:type="paragraph" w:styleId="Liste">
     <w:name w:val="List"/>
-    <w:basedOn w:val="Normal"/>
+    <w:basedOn w:val="Standard"/>
     <w:uiPriority w:val="99"/>
     <w:unhideWhenUsed/>
     <w:pPr>
@@ -7834,10 +8295,10 @@
       <w:contextualSpacing/>
     </w:pPr>
   </w:style>
-  <w:style w:type="character" w:customStyle="1" w:styleId="BodyTextChar">
-    <w:name w:val="Body Text Char"/>
-    <w:basedOn w:val="DefaultParagraphFont"/>
-    <w:link w:val="BodyText"/>
+  <w:style w:type="character" w:customStyle="1" w:styleId="TextkrperZchn">
+    <w:name w:val="Textkörper Zchn"/>
+    <w:basedOn w:val="Absatz-Standardschriftart"/>
+    <w:link w:val="Textkrper"/>
     <w:rsid w:val="00336A23"/>
     <w:rPr>
       <w:sz w:val="22"/>
@@ -7845,9 +8306,9 @@
       <w:lang w:val="de-DE" w:eastAsia="de-DE"/>
     </w:rPr>
   </w:style>
-  <w:style w:type="paragraph" w:styleId="ListNumber">
+  <w:style w:type="paragraph" w:styleId="Listennummer">
     <w:name w:val="List Number"/>
-    <w:basedOn w:val="Normal"/>
+    <w:basedOn w:val="Standard"/>
     <w:uiPriority w:val="99"/>
     <w:unhideWhenUsed/>
     <w:pPr>
@@ -7857,9 +8318,9 @@
       <w:contextualSpacing/>
     </w:pPr>
   </w:style>
-  <w:style w:type="paragraph" w:styleId="ListBullet">
+  <w:style w:type="paragraph" w:styleId="Aufzhlungszeichen">
     <w:name w:val="List Bullet"/>
-    <w:basedOn w:val="Normal"/>
+    <w:basedOn w:val="Standard"/>
     <w:uiPriority w:val="99"/>
     <w:unhideWhenUsed/>
     <w:pPr>
@@ -7871,7 +8332,7 @@
   </w:style>
   <w:style w:type="paragraph" w:customStyle="1" w:styleId="berschrift2Abstract">
     <w:name w:val="Überschrift 2 Abstract"/>
-    <w:basedOn w:val="Heading2"/>
+    <w:basedOn w:val="berschrift2"/>
     <w:pPr>
       <w:numPr>
         <w:ilvl w:val="0"/>
@@ -7881,7 +8342,7 @@
   </w:style>
   <w:style w:type="paragraph" w:customStyle="1" w:styleId="berschrift3Abstract">
     <w:name w:val="Überschrift 3 Abstract"/>
-    <w:basedOn w:val="Heading3"/>
+    <w:basedOn w:val="berschrift3"/>
     <w:pPr>
       <w:numPr>
         <w:ilvl w:val="0"/>
@@ -7889,10 +8350,10 @@
       </w:numPr>
     </w:pPr>
   </w:style>
-  <w:style w:type="paragraph" w:styleId="Caption">
+  <w:style w:type="paragraph" w:styleId="Beschriftung">
     <w:name w:val="caption"/>
-    <w:basedOn w:val="Normal"/>
-    <w:next w:val="Normal"/>
+    <w:basedOn w:val="Standard"/>
+    <w:next w:val="Standard"/>
     <w:uiPriority w:val="35"/>
     <w:unhideWhenUsed/>
     <w:qFormat/>
@@ -7906,10 +8367,10 @@
       <w:szCs w:val="18"/>
     </w:rPr>
   </w:style>
-  <w:style w:type="paragraph" w:styleId="CommentText">
+  <w:style w:type="paragraph" w:styleId="Kommentartext">
     <w:name w:val="annotation text"/>
-    <w:basedOn w:val="Normal"/>
-    <w:link w:val="CommentTextChar"/>
+    <w:basedOn w:val="Standard"/>
+    <w:link w:val="KommentartextZchn"/>
     <w:uiPriority w:val="99"/>
     <w:unhideWhenUsed/>
     <w:pPr>
@@ -7920,10 +8381,10 @@
       <w:szCs w:val="20"/>
     </w:rPr>
   </w:style>
-  <w:style w:type="character" w:customStyle="1" w:styleId="CommentTextChar">
-    <w:name w:val="Comment Text Char"/>
-    <w:basedOn w:val="DefaultParagraphFont"/>
-    <w:link w:val="CommentText"/>
+  <w:style w:type="character" w:customStyle="1" w:styleId="KommentartextZchn">
+    <w:name w:val="Kommentartext Zchn"/>
+    <w:basedOn w:val="Absatz-Standardschriftart"/>
+    <w:link w:val="Kommentartext"/>
     <w:uiPriority w:val="99"/>
     <w:rPr>
       <w:sz w:val="20"/>
@@ -7931,9 +8392,9 @@
       <w:lang w:val="de-DE" w:eastAsia="de-DE"/>
     </w:rPr>
   </w:style>
-  <w:style w:type="character" w:styleId="CommentReference">
+  <w:style w:type="character" w:styleId="Kommentarzeichen">
     <w:name w:val="annotation reference"/>
-    <w:basedOn w:val="DefaultParagraphFont"/>
+    <w:basedOn w:val="Absatz-Standardschriftart"/>
     <w:uiPriority w:val="99"/>
     <w:semiHidden/>
     <w:unhideWhenUsed/>
@@ -7942,7 +8403,7 @@
       <w:szCs w:val="16"/>
     </w:rPr>
   </w:style>
-  <w:style w:type="paragraph" w:styleId="Revision">
+  <w:style w:type="paragraph" w:styleId="berarbeitung">
     <w:name w:val="Revision"/>
     <w:hidden/>
     <w:uiPriority w:val="99"/>
@@ -7953,11 +8414,11 @@
       <w:lang w:val="de-DE" w:eastAsia="de-DE"/>
     </w:rPr>
   </w:style>
-  <w:style w:type="paragraph" w:styleId="CommentSubject">
+  <w:style w:type="paragraph" w:styleId="Kommentarthema">
     <w:name w:val="annotation subject"/>
-    <w:basedOn w:val="CommentText"/>
-    <w:next w:val="CommentText"/>
-    <w:link w:val="CommentSubjectChar"/>
+    <w:basedOn w:val="Kommentartext"/>
+    <w:next w:val="Kommentartext"/>
+    <w:link w:val="KommentarthemaZchn"/>
     <w:uiPriority w:val="99"/>
     <w:semiHidden/>
     <w:unhideWhenUsed/>
@@ -7967,10 +8428,10 @@
       <w:bCs/>
     </w:rPr>
   </w:style>
-  <w:style w:type="character" w:customStyle="1" w:styleId="CommentSubjectChar">
-    <w:name w:val="Comment Subject Char"/>
-    <w:basedOn w:val="CommentTextChar"/>
-    <w:link w:val="CommentSubject"/>
+  <w:style w:type="character" w:customStyle="1" w:styleId="KommentarthemaZchn">
+    <w:name w:val="Kommentarthema Zchn"/>
+    <w:basedOn w:val="KommentartextZchn"/>
+    <w:link w:val="Kommentarthema"/>
     <w:uiPriority w:val="99"/>
     <w:semiHidden/>
     <w:rsid w:val="003A1D22"/>
@@ -7980,6 +8441,82 @@
       <w:sz w:val="20"/>
       <w:szCs w:val="20"/>
       <w:lang w:val="de-DE" w:eastAsia="de-DE"/>
+    </w:rPr>
+  </w:style>
+  <w:style w:type="paragraph" w:styleId="TitlePageTitle">
+    <w:name w:val="TitlePageTitle"/>
+    <w:basedOn w:val="Standard"/>
+    <w:qFormat/>
+    <w:pPr>
+      <w:jc w:val="center"/>
+      <w:spacing w:after="240"/>
+    </w:pPr>
+    <w:rPr>
+      <w:rFonts w:ascii="Arial" w:hAnsi="Arial"/>
+      <w:sz w:val="44"/>
+      <w:szCs w:val="44"/>
+      <w:b/>
+      <w:bCs/>
+    </w:rPr>
+  </w:style>
+  <w:style w:type="paragraph" w:styleId="TitlePageSubtitle">
+    <w:name w:val="TitlePageSubtitle"/>
+    <w:basedOn w:val="Standard"/>
+    <w:qFormat/>
+    <w:pPr>
+      <w:jc w:val="center"/>
+      <w:spacing w:after="360"/>
+    </w:pPr>
+    <w:rPr>
+      <w:rFonts w:ascii="Arial" w:hAnsi="Arial"/>
+      <w:sz w:val="28"/>
+      <w:szCs w:val="28"/>
+      <w:b/>
+      <w:bCs/>
+    </w:rPr>
+  </w:style>
+  <w:style w:type="paragraph" w:styleId="TitlePageLine">
+    <w:name w:val="TitlePageLine"/>
+    <w:basedOn w:val="Standard"/>
+    <w:qFormat/>
+    <w:pPr>
+      <w:jc w:val="center"/>
+      <w:spacing w:after="120"/>
+    </w:pPr>
+    <w:rPr>
+      <w:rFonts w:ascii="Arial" w:hAnsi="Arial"/>
+      <w:sz w:val="22"/>
+      <w:szCs w:val="22"/>
+    </w:rPr>
+  </w:style>
+  <w:style w:type="paragraph" w:styleId="TitlePageAdvisorLabel">
+    <w:name w:val="TitlePageAdvisorLabel"/>
+    <w:basedOn w:val="Standard"/>
+    <w:qFormat/>
+    <w:pPr>
+      <w:jc w:val="left"/>
+      <w:spacing w:after="0"/>
+    </w:pPr>
+    <w:rPr>
+      <w:rFonts w:ascii="Arial" w:hAnsi="Arial"/>
+      <w:sz w:val="22"/>
+      <w:szCs w:val="22"/>
+      <w:b/>
+      <w:bCs/>
+    </w:rPr>
+  </w:style>
+  <w:style w:type="paragraph" w:styleId="TitlePageAdvisor">
+    <w:name w:val="TitlePageAdvisor"/>
+    <w:basedOn w:val="Standard"/>
+    <w:qFormat/>
+    <w:pPr>
+      <w:jc w:val="left"/>
+      <w:spacing w:after="240"/>
+    </w:pPr>
+    <w:rPr>
+      <w:rFonts w:ascii="Arial" w:hAnsi="Arial"/>
+      <w:sz w:val="22"/>
+      <w:szCs w:val="22"/>
     </w:rPr>
   </w:style>
 </w:styles>
@@ -8269,20 +8806,6 @@
 </file>
 
 <file path=customXml/item1.xml><?xml version="1.0" encoding="utf-8"?>
-<p:properties xmlns:p="http://schemas.microsoft.com/office/2006/metadata/properties" xmlns:xsi="http://www.w3.org/2001/XMLSchema-instance">
-  <documentManagement>
-    <SharedWithUsers xmlns="5137f360-fa0c-4b2e-81d9-0f1d032534dd">
-      <UserInfo>
-        <DisplayName>Lutz Nathanael</DisplayName>
-        <AccountId>125</AccountId>
-        <AccountType/>
-      </UserInfo>
-    </SharedWithUsers>
-  </documentManagement>
-</p:properties>
-</file>
-
-<file path=customXml/item2.xml><?xml version="1.0" encoding="utf-8"?>
 <b:Sources xmlns:b="http://schemas.openxmlformats.org/officeDocument/2006/bibliography" xmlns="http://schemas.openxmlformats.org/officeDocument/2006/bibliography" SelectedStyle="\APA.XSL" StyleName="APA">
   <b:Source>
     <b:Tag>Cina</b:Tag>
@@ -8368,16 +8891,193 @@
 </b:Sources>
 </file>
 
+<file path=customXml/item2.xml><?xml version="1.0" encoding="utf-8"?>
+<p:properties xmlns:p="http://schemas.microsoft.com/office/2006/metadata/properties" xmlns:xsi="http://www.w3.org/2001/XMLSchema-instance">
+  <documentManagement>
+    <SharedWithUsers xmlns="5137f360-fa0c-4b2e-81d9-0f1d032534dd">
+      <UserInfo>
+        <DisplayName>Lutz Nathanael</DisplayName>
+        <AccountId>125</AccountId>
+        <AccountType/>
+      </UserInfo>
+    </SharedWithUsers>
+  </documentManagement>
+</p:properties>
+</file>
+
 <file path=customXml/item3.xml><?xml version="1.0" encoding="utf-8"?>
-<?mso-contentType ?>
-<FormTemplates xmlns="http://schemas.microsoft.com/sharepoint/v3/contenttype/forms">
-  <Display>DocumentLibraryForm</Display>
-  <Edit>DocumentLibraryForm</Edit>
-  <New>DocumentLibraryForm</New>
-</FormTemplates>
+<b:Sources xmlns:b="http://schemas.openxmlformats.org/officeDocument/2006/bibliography" xmlns="http://schemas.openxmlformats.org/officeDocument/2006/bibliography" SelectedStyle="\APA.XSL" StyleName="APA">
+  <b:Source>
+    <b:Tag>Cina</b:Tag>
+    <b:SourceType>ArticleInAPeriodical</b:SourceType>
+    <b:Guid>{EFD64E2B-DBD8-4A5A-A741-A1444D929DC2}</b:Guid>
+    <b:Author>
+      <b:Author>
+        <b:NameList>
+          <b:Person>
+            <b:Last>Cina-Tschumi</b:Last>
+            <b:First>B</b:First>
+          </b:Person>
+        </b:NameList>
+      </b:Author>
+    </b:Author>
+    <b:Title>Evidenz-basierte Pflege am Beispiel von Kälteanwendungen nach ausgewähltenorthopädischen Eingriffen – eine Literaturstudie</b:Title>
+    <b:PeriodicalTitle>Pflege</b:PeriodicalTitle>
+    <b:Year>2007</b:Year>
+    <b:Pages>258-267</b:Pages>
+    <b:Issue>20</b:Issue>
+    <b:RefOrder>2</b:RefOrder>
+  </b:Source>
+  <b:Source>
+    <b:Tag>BFH</b:Tag>
+    <b:SourceType>InternetSite</b:SourceType>
+    <b:Guid>{51B1224E-7633-421A-B9B6-8252A0A038BF}</b:Guid>
+    <b:Author>
+      <b:Author>
+        <b:Corporate>Berner Fachhochschule</b:Corporate>
+      </b:Author>
+    </b:Author>
+    <b:Title>Richtlinien über den Umgang mit Plagiaten an der Berner Fachhochschule</b:Title>
+    <b:URL>http://www.bfh.ch/bfh/rechtlichegrundlagen/studienreglemente.html</b:URL>
+    <b:Year>2009</b:Year>
+    <b:DayAccessed>12</b:DayAccessed>
+    <b:YearAccessed>2009</b:YearAccessed>
+    <b:MonthAccessed>September</b:MonthAccessed>
+    <b:RefOrder>1</b:RefOrder>
+  </b:Source>
+  <b:Source>
+    <b:Tag>Gie06</b:Tag>
+    <b:SourceType>BookSection</b:SourceType>
+    <b:Guid>{8DA91BDD-DE76-4055-9936-8A3B0B476BE3}</b:Guid>
+    <b:Author>
+      <b:Author>
+        <b:NameList>
+          <b:Person>
+            <b:Last>Gieseke</b:Last>
+            <b:First>M.</b:First>
+          </b:Person>
+          <b:Person>
+            <b:Last>Matscheko</b:Last>
+            <b:First>N.</b:First>
+          </b:Person>
+        </b:NameList>
+      </b:Author>
+      <b:BookAuthor>
+        <b:NameList>
+          <b:Person>
+            <b:Last>Heuwinkel-Otter</b:Last>
+            <b:First>A.</b:First>
+          </b:Person>
+          <b:Person>
+            <b:Last>Nümann-Dulke</b:Last>
+            <b:First>A.</b:First>
+          </b:Person>
+          <b:Person>
+            <b:Last>Matscheko</b:Last>
+            <b:First>N.</b:First>
+          </b:Person>
+        </b:NameList>
+      </b:BookAuthor>
+    </b:Author>
+    <b:Title>Pflegequalität</b:Title>
+    <b:Year>2006</b:Year>
+    <b:BookTitle>Menschen pflegen</b:BookTitle>
+    <b:Pages>113-132</b:Pages>
+    <b:City>Heidelberg</b:City>
+    <b:Publisher>Springer</b:Publisher>
+    <b:Volume>1</b:Volume>
+    <b:RefOrder>3</b:RefOrder>
+  </b:Source>
+</b:Sources>
 </file>
 
 <file path=customXml/item4.xml><?xml version="1.0" encoding="utf-8"?>
+<b:Sources xmlns:b="http://schemas.openxmlformats.org/officeDocument/2006/bibliography" xmlns="http://schemas.openxmlformats.org/officeDocument/2006/bibliography" SelectedStyle="\APA.XSL" StyleName="APA">
+  <b:Source>
+    <b:Tag>Cina</b:Tag>
+    <b:SourceType>ArticleInAPeriodical</b:SourceType>
+    <b:Guid>{EFD64E2B-DBD8-4A5A-A741-A1444D929DC2}</b:Guid>
+    <b:Author>
+      <b:Author>
+        <b:NameList>
+          <b:Person>
+            <b:Last>Cina-Tschumi</b:Last>
+            <b:First>B</b:First>
+          </b:Person>
+        </b:NameList>
+      </b:Author>
+    </b:Author>
+    <b:Title>Evidenz-basierte Pflege am Beispiel von Kälteanwendungen nach ausgewähltenorthopädischen Eingriffen – eine Literaturstudie</b:Title>
+    <b:PeriodicalTitle>Pflege</b:PeriodicalTitle>
+    <b:Year>2007</b:Year>
+    <b:Pages>258-267</b:Pages>
+    <b:Issue>20</b:Issue>
+    <b:RefOrder>2</b:RefOrder>
+  </b:Source>
+  <b:Source>
+    <b:Tag>BFH</b:Tag>
+    <b:SourceType>InternetSite</b:SourceType>
+    <b:Guid>{51B1224E-7633-421A-B9B6-8252A0A038BF}</b:Guid>
+    <b:Author>
+      <b:Author>
+        <b:Corporate>Berner Fachhochschule</b:Corporate>
+      </b:Author>
+    </b:Author>
+    <b:Title>Richtlinien über den Umgang mit Plagiaten an der Berner Fachhochschule</b:Title>
+    <b:URL>http://www.bfh.ch/bfh/rechtlichegrundlagen/studienreglemente.html</b:URL>
+    <b:Year>2009</b:Year>
+    <b:DayAccessed>12</b:DayAccessed>
+    <b:YearAccessed>2009</b:YearAccessed>
+    <b:MonthAccessed>September</b:MonthAccessed>
+    <b:RefOrder>1</b:RefOrder>
+  </b:Source>
+  <b:Source>
+    <b:Tag>Gie06</b:Tag>
+    <b:SourceType>BookSection</b:SourceType>
+    <b:Guid>{8DA91BDD-DE76-4055-9936-8A3B0B476BE3}</b:Guid>
+    <b:Author>
+      <b:Author>
+        <b:NameList>
+          <b:Person>
+            <b:Last>Gieseke</b:Last>
+            <b:First>M.</b:First>
+          </b:Person>
+          <b:Person>
+            <b:Last>Matscheko</b:Last>
+            <b:First>N.</b:First>
+          </b:Person>
+        </b:NameList>
+      </b:Author>
+      <b:BookAuthor>
+        <b:NameList>
+          <b:Person>
+            <b:Last>Heuwinkel-Otter</b:Last>
+            <b:First>A.</b:First>
+          </b:Person>
+          <b:Person>
+            <b:Last>Nümann-Dulke</b:Last>
+            <b:First>A.</b:First>
+          </b:Person>
+          <b:Person>
+            <b:Last>Matscheko</b:Last>
+            <b:First>N.</b:First>
+          </b:Person>
+        </b:NameList>
+      </b:BookAuthor>
+    </b:Author>
+    <b:Title>Pflegequalität</b:Title>
+    <b:Year>2006</b:Year>
+    <b:BookTitle>Menschen pflegen</b:BookTitle>
+    <b:Pages>113-132</b:Pages>
+    <b:City>Heidelberg</b:City>
+    <b:Publisher>Springer</b:Publisher>
+    <b:Volume>1</b:Volume>
+    <b:RefOrder>3</b:RefOrder>
+  </b:Source>
+</b:Sources>
+</file>
+
+<file path=customXml/item5.xml><?xml version="1.0" encoding="utf-8"?>
 <ct:contentTypeSchema xmlns:ct="http://schemas.microsoft.com/office/2006/metadata/contentType" xmlns:ma="http://schemas.microsoft.com/office/2006/metadata/properties/metaAttributes" ct:_="" ma:_="" ma:contentTypeName="Dokument" ma:contentTypeID="0x010100813895525622BD4C9458B78387D5182C" ma:contentTypeVersion="13" ma:contentTypeDescription="Ein neues Dokument erstellen." ma:contentTypeScope="" ma:versionID="4c08fc8f302e082c268dd4f4a9a63675">
   <xsd:schema xmlns:xsd="http://www.w3.org/2001/XMLSchema" xmlns:xs="http://www.w3.org/2001/XMLSchema" xmlns:p="http://schemas.microsoft.com/office/2006/metadata/properties" xmlns:ns2="4a9d1253-9b07-49ce-83ef-ecaaf0492256" xmlns:ns3="5137f360-fa0c-4b2e-81d9-0f1d032534dd" targetNamespace="http://schemas.microsoft.com/office/2006/metadata/properties" ma:root="true" ma:fieldsID="79799332e6fe650a84a8c6f0ec1cc0c7" ns2:_="" ns3:_="">
     <xsd:import namespace="4a9d1253-9b07-49ce-83ef-ecaaf0492256"/>
@@ -8600,179 +9300,24 @@
 </ct:contentTypeSchema>
 </file>
 
-<file path=customXml/item5.xml><?xml version="1.0" encoding="utf-8"?>
-<b:Sources xmlns:b="http://schemas.openxmlformats.org/officeDocument/2006/bibliography" xmlns="http://schemas.openxmlformats.org/officeDocument/2006/bibliography" SelectedStyle="\APA.XSL" StyleName="APA">
-  <b:Source>
-    <b:Tag>Cina</b:Tag>
-    <b:SourceType>ArticleInAPeriodical</b:SourceType>
-    <b:Guid>{EFD64E2B-DBD8-4A5A-A741-A1444D929DC2}</b:Guid>
-    <b:Author>
-      <b:Author>
-        <b:NameList>
-          <b:Person>
-            <b:Last>Cina-Tschumi</b:Last>
-            <b:First>B</b:First>
-          </b:Person>
-        </b:NameList>
-      </b:Author>
-    </b:Author>
-    <b:Title>Evidenz-basierte Pflege am Beispiel von Kälteanwendungen nach ausgewähltenorthopädischen Eingriffen – eine Literaturstudie</b:Title>
-    <b:PeriodicalTitle>Pflege</b:PeriodicalTitle>
-    <b:Year>2007</b:Year>
-    <b:Pages>258-267</b:Pages>
-    <b:Issue>20</b:Issue>
-    <b:RefOrder>2</b:RefOrder>
-  </b:Source>
-  <b:Source>
-    <b:Tag>BFH</b:Tag>
-    <b:SourceType>InternetSite</b:SourceType>
-    <b:Guid>{51B1224E-7633-421A-B9B6-8252A0A038BF}</b:Guid>
-    <b:Author>
-      <b:Author>
-        <b:Corporate>Berner Fachhochschule</b:Corporate>
-      </b:Author>
-    </b:Author>
-    <b:Title>Richtlinien über den Umgang mit Plagiaten an der Berner Fachhochschule</b:Title>
-    <b:URL>http://www.bfh.ch/bfh/rechtlichegrundlagen/studienreglemente.html</b:URL>
-    <b:Year>2009</b:Year>
-    <b:DayAccessed>12</b:DayAccessed>
-    <b:YearAccessed>2009</b:YearAccessed>
-    <b:MonthAccessed>September</b:MonthAccessed>
-    <b:RefOrder>1</b:RefOrder>
-  </b:Source>
-  <b:Source>
-    <b:Tag>Gie06</b:Tag>
-    <b:SourceType>BookSection</b:SourceType>
-    <b:Guid>{8DA91BDD-DE76-4055-9936-8A3B0B476BE3}</b:Guid>
-    <b:Author>
-      <b:Author>
-        <b:NameList>
-          <b:Person>
-            <b:Last>Gieseke</b:Last>
-            <b:First>M.</b:First>
-          </b:Person>
-          <b:Person>
-            <b:Last>Matscheko</b:Last>
-            <b:First>N.</b:First>
-          </b:Person>
-        </b:NameList>
-      </b:Author>
-      <b:BookAuthor>
-        <b:NameList>
-          <b:Person>
-            <b:Last>Heuwinkel-Otter</b:Last>
-            <b:First>A.</b:First>
-          </b:Person>
-          <b:Person>
-            <b:Last>Nümann-Dulke</b:Last>
-            <b:First>A.</b:First>
-          </b:Person>
-          <b:Person>
-            <b:Last>Matscheko</b:Last>
-            <b:First>N.</b:First>
-          </b:Person>
-        </b:NameList>
-      </b:BookAuthor>
-    </b:Author>
-    <b:Title>Pflegequalität</b:Title>
-    <b:Year>2006</b:Year>
-    <b:BookTitle>Menschen pflegen</b:BookTitle>
-    <b:Pages>113-132</b:Pages>
-    <b:City>Heidelberg</b:City>
-    <b:Publisher>Springer</b:Publisher>
-    <b:Volume>1</b:Volume>
-    <b:RefOrder>3</b:RefOrder>
-  </b:Source>
-</b:Sources>
-</file>
-
 <file path=customXml/item6.xml><?xml version="1.0" encoding="utf-8"?>
-<b:Sources xmlns:b="http://schemas.openxmlformats.org/officeDocument/2006/bibliography" xmlns="http://schemas.openxmlformats.org/officeDocument/2006/bibliography" SelectedStyle="\APA.XSL" StyleName="APA">
-  <b:Source>
-    <b:Tag>Cina</b:Tag>
-    <b:SourceType>ArticleInAPeriodical</b:SourceType>
-    <b:Guid>{EFD64E2B-DBD8-4A5A-A741-A1444D929DC2}</b:Guid>
-    <b:Author>
-      <b:Author>
-        <b:NameList>
-          <b:Person>
-            <b:Last>Cina-Tschumi</b:Last>
-            <b:First>B</b:First>
-          </b:Person>
-        </b:NameList>
-      </b:Author>
-    </b:Author>
-    <b:Title>Evidenz-basierte Pflege am Beispiel von Kälteanwendungen nach ausgewähltenorthopädischen Eingriffen – eine Literaturstudie</b:Title>
-    <b:PeriodicalTitle>Pflege</b:PeriodicalTitle>
-    <b:Year>2007</b:Year>
-    <b:Pages>258-267</b:Pages>
-    <b:Issue>20</b:Issue>
-    <b:RefOrder>2</b:RefOrder>
-  </b:Source>
-  <b:Source>
-    <b:Tag>BFH</b:Tag>
-    <b:SourceType>InternetSite</b:SourceType>
-    <b:Guid>{51B1224E-7633-421A-B9B6-8252A0A038BF}</b:Guid>
-    <b:Author>
-      <b:Author>
-        <b:Corporate>Berner Fachhochschule</b:Corporate>
-      </b:Author>
-    </b:Author>
-    <b:Title>Richtlinien über den Umgang mit Plagiaten an der Berner Fachhochschule</b:Title>
-    <b:URL>http://www.bfh.ch/bfh/rechtlichegrundlagen/studienreglemente.html</b:URL>
-    <b:Year>2009</b:Year>
-    <b:DayAccessed>12</b:DayAccessed>
-    <b:YearAccessed>2009</b:YearAccessed>
-    <b:MonthAccessed>September</b:MonthAccessed>
-    <b:RefOrder>1</b:RefOrder>
-  </b:Source>
-  <b:Source>
-    <b:Tag>Gie06</b:Tag>
-    <b:SourceType>BookSection</b:SourceType>
-    <b:Guid>{8DA91BDD-DE76-4055-9936-8A3B0B476BE3}</b:Guid>
-    <b:Author>
-      <b:Author>
-        <b:NameList>
-          <b:Person>
-            <b:Last>Gieseke</b:Last>
-            <b:First>M.</b:First>
-          </b:Person>
-          <b:Person>
-            <b:Last>Matscheko</b:Last>
-            <b:First>N.</b:First>
-          </b:Person>
-        </b:NameList>
-      </b:Author>
-      <b:BookAuthor>
-        <b:NameList>
-          <b:Person>
-            <b:Last>Heuwinkel-Otter</b:Last>
-            <b:First>A.</b:First>
-          </b:Person>
-          <b:Person>
-            <b:Last>Nümann-Dulke</b:Last>
-            <b:First>A.</b:First>
-          </b:Person>
-          <b:Person>
-            <b:Last>Matscheko</b:Last>
-            <b:First>N.</b:First>
-          </b:Person>
-        </b:NameList>
-      </b:BookAuthor>
-    </b:Author>
-    <b:Title>Pflegequalität</b:Title>
-    <b:Year>2006</b:Year>
-    <b:BookTitle>Menschen pflegen</b:BookTitle>
-    <b:Pages>113-132</b:Pages>
-    <b:City>Heidelberg</b:City>
-    <b:Publisher>Springer</b:Publisher>
-    <b:Volume>1</b:Volume>
-    <b:RefOrder>3</b:RefOrder>
-  </b:Source>
-</b:Sources>
+<?mso-contentType ?>
+<FormTemplates xmlns="http://schemas.microsoft.com/sharepoint/v3/contenttype/forms">
+  <Display>DocumentLibraryForm</Display>
+  <Edit>DocumentLibraryForm</Edit>
+  <New>DocumentLibraryForm</New>
+</FormTemplates>
 </file>
 
 <file path=customXml/itemProps1.xml><?xml version="1.0" encoding="utf-8"?>
+<ds:datastoreItem xmlns:ds="http://schemas.openxmlformats.org/officeDocument/2006/customXml" ds:itemID="{C719EC45-D2F9-4C97-85D1-AEDFE860004D}">
+  <ds:schemaRefs>
+    <ds:schemaRef ds:uri="http://schemas.openxmlformats.org/officeDocument/2006/bibliography"/>
+  </ds:schemaRefs>
+</ds:datastoreItem>
+</file>
+
+<file path=customXml/itemProps2.xml><?xml version="1.0" encoding="utf-8"?>
 <ds:datastoreItem xmlns:ds="http://schemas.openxmlformats.org/officeDocument/2006/customXml" ds:itemID="{2C13B81A-1182-42A4-86C6-E39B6F4DE2B3}">
   <ds:schemaRefs>
     <ds:schemaRef ds:uri="http://schemas.microsoft.com/office/2006/metadata/properties"/>
@@ -8781,23 +9326,23 @@
 </ds:datastoreItem>
 </file>
 
-<file path=customXml/itemProps2.xml><?xml version="1.0" encoding="utf-8"?>
-<ds:datastoreItem xmlns:ds="http://schemas.openxmlformats.org/officeDocument/2006/customXml" ds:itemID="{C719EC45-D2F9-4C97-85D1-AEDFE860004D}">
+<file path=customXml/itemProps3.xml><?xml version="1.0" encoding="utf-8"?>
+<ds:datastoreItem xmlns:ds="http://schemas.openxmlformats.org/officeDocument/2006/customXml" ds:itemID="{54CDC8B7-C5DF-4371-9624-DE6980E51345}">
   <ds:schemaRefs>
     <ds:schemaRef ds:uri="http://schemas.openxmlformats.org/officeDocument/2006/bibliography"/>
   </ds:schemaRefs>
 </ds:datastoreItem>
 </file>
 
-<file path=customXml/itemProps3.xml><?xml version="1.0" encoding="utf-8"?>
-<ds:datastoreItem xmlns:ds="http://schemas.openxmlformats.org/officeDocument/2006/customXml" ds:itemID="{6EACDB63-E280-4376-8F27-16FBE69C1E17}">
+<file path=customXml/itemProps4.xml><?xml version="1.0" encoding="utf-8"?>
+<ds:datastoreItem xmlns:ds="http://schemas.openxmlformats.org/officeDocument/2006/customXml" ds:itemID="{F02FB088-DB5F-47FF-8DBD-74DD09538403}">
   <ds:schemaRefs>
-    <ds:schemaRef ds:uri="http://schemas.microsoft.com/sharepoint/v3/contenttype/forms"/>
+    <ds:schemaRef ds:uri="http://schemas.openxmlformats.org/officeDocument/2006/bibliography"/>
   </ds:schemaRefs>
 </ds:datastoreItem>
 </file>
 
-<file path=customXml/itemProps4.xml><?xml version="1.0" encoding="utf-8"?>
+<file path=customXml/itemProps5.xml><?xml version="1.0" encoding="utf-8"?>
 <ds:datastoreItem xmlns:ds="http://schemas.openxmlformats.org/officeDocument/2006/customXml" ds:itemID="{FE54BA80-F24C-4C04-A3B2-7CE47A022DE3}">
   <ds:schemaRefs>
     <ds:schemaRef ds:uri="http://schemas.microsoft.com/office/2006/metadata/contentType"/>
@@ -8816,18 +9361,10 @@
 </ds:datastoreItem>
 </file>
 
-<file path=customXml/itemProps5.xml><?xml version="1.0" encoding="utf-8"?>
-<ds:datastoreItem xmlns:ds="http://schemas.openxmlformats.org/officeDocument/2006/customXml" ds:itemID="{F02FB088-DB5F-47FF-8DBD-74DD09538403}">
+<file path=customXml/itemProps6.xml><?xml version="1.0" encoding="utf-8"?>
+<ds:datastoreItem xmlns:ds="http://schemas.openxmlformats.org/officeDocument/2006/customXml" ds:itemID="{6EACDB63-E280-4376-8F27-16FBE69C1E17}">
   <ds:schemaRefs>
-    <ds:schemaRef ds:uri="http://schemas.openxmlformats.org/officeDocument/2006/bibliography"/>
-  </ds:schemaRefs>
-</ds:datastoreItem>
-</file>
-
-<file path=customXml/itemProps6.xml><?xml version="1.0" encoding="utf-8"?>
-<ds:datastoreItem xmlns:ds="http://schemas.openxmlformats.org/officeDocument/2006/customXml" ds:itemID="{54CDC8B7-C5DF-4371-9624-DE6980E51345}">
-  <ds:schemaRefs>
-    <ds:schemaRef ds:uri="http://schemas.openxmlformats.org/officeDocument/2006/bibliography"/>
+    <ds:schemaRef ds:uri="http://schemas.microsoft.com/sharepoint/v3/contenttype/forms"/>
   </ds:schemaRefs>
 </ds:datastoreItem>
 </file>
</xml_diff>